<commit_message>
Update report with Minikube deployment validation
</commit_message>
<xml_diff>
--- a/MLOps_Assignment_Report.docx
+++ b/MLOps_Assignment_Report.docx
@@ -143,11 +143,9 @@
     </w:p>
     <w:p>
       <w:r>
-        <w:t>This project demonstrates an end-to-end machine-learning workflow for a binary heart-disease classification task using the Cleveland heart-disease dataset. It covers data inspection and exploratory analysis, preprocessing and model comparison, experiment tracking with MLflow, a FastAPI inference service, automated tests, continuous integration, and container packaging with Docker and Docker Compose. Kubernetes Deployment and Service manifests are included as deployment configuration; an actual Kubernetes ro</w:t>
-      </w:r>
-      <w:r>
-        <w:t>llout is not claimed because a cluster was not available in the development environment.</w:t>
-      </w:r>
+        <w:t>This project demonstrates an end-to-end machine-learning workflow for a binary heart-disease classification task using the Cleveland heart-disease dataset. It covers data inspection and exploratory analysis, preprocessing and model comparison, experiment tracking with MLflow, a FastAPI inference service, automated tests, continuous integration, and container packaging with Docker and Docker Compose. The API was also deployed and validated on a local Minikube Kubernetes cluster. This local validation does not represent a production or externally accessible cluster deployment.</w:t>
+      </w:r>
+      <w:r/>
     </w:p>
     <w:p>
       <w:pPr>
@@ -1874,7 +1872,7 @@
     </w:p>
     <w:p>
       <w:r>
-        <w:t>{"prediction":0,"interpretation":"heart disease not detected by model","probability_class_1":0.3567}</w:t>
+        <w:t>{"prediction":0,"interpretation":"heart disease not detected by model","probability_class_1":0.3267}</w:t>
       </w:r>
     </w:p>
     <w:p>
@@ -1945,11 +1943,9 @@
     </w:p>
     <w:p>
       <w:r>
-        <w:t xml:space="preserve">The docker-compose.yml file defines the API service, publishes port 8000, configures a restart policy, and checks the /health endpoint. The API was tested </w:t>
-      </w:r>
-      <w:r>
-        <w:t>successfully through Docker Compose in the development VM.</w:t>
-      </w:r>
+        <w:t>The docker-compose.yml file defines the API service, publishes host port 8001 to container port 8000, configures a restart policy, and checks the /health endpoint. The API was tested successfully through Docker Compose in the development VM.</w:t>
+      </w:r>
+      <w:r/>
     </w:p>
     <w:p>
       <w:pPr>
@@ -1988,7 +1984,7 @@
         <w:pStyle w:val="ListBullet"/>
       </w:pPr>
       <w:r>
-        <w:t>curl http://localhost:8000/health — verify the health endpoint.</w:t>
+        <w:t>curl http://localhost:8001/health — verify the Docker Compose health endpoint.</w:t>
       </w:r>
     </w:p>
     <w:p>
@@ -2055,11 +2051,9 @@
     </w:p>
     <w:p>
       <w:r>
-        <w:t>The repository contains deployment/deployment.yaml and deployment/service.yaml. The Deployment specifies one replica, container port 8000, resource requests and limits, and readiness/liveness probes. The Service exposes port 8000 internally within the cluster. These files are configuration artifacts only: a Kubernetes cluster and kubectl were not available in the development VM, so an actual Kubernetes rollout was not performed. A remote cluster would also need access to the image, normally through a regist</w:t>
-      </w:r>
-      <w:r>
-        <w:t>ry.</w:t>
-      </w:r>
+        <w:t>The repository contains deployment/deployment.yaml and deployment/service.yaml. These manifests were applied successfully to a local Minikube Kubernetes cluster. The heart-disease-api Deployment reached 1/1 available replicas, and its pod was Running with zero restarts during validation. The ClusterIP Service exposes port 8000 internally. The /health endpoint returned HTTP 200 with {"status":"healthy","model_loaded":true}, and a POST request to /predict returned a valid JSON prediction. Testing used port forwarding from local port 8002 to service port 8000. This validates a local Minikube deployment, not a production or externally accessible cluster. A remote cluster would also need access to the image, normally through a registry.</w:t>
+      </w:r>
+      <w:r/>
     </w:p>
     <w:p>
       <w:pPr>
@@ -2098,7 +2092,7 @@
         <w:pStyle w:val="ListBullet"/>
       </w:pPr>
       <w:r>
-        <w:t>Kubernetes manifests have not been applied to a cluster.</w:t>
+        <w:t>Local Minikube deployment was tested successfully; production deployment, external access, and remote-cluster validation remain outside the scope of this demonstration.</w:t>
       </w:r>
     </w:p>
     <w:p>
@@ -2146,7 +2140,7 @@
         <w:pStyle w:val="ListBullet"/>
       </w:pPr>
       <w:r>
-        <w:t>Publish the image to a registry and deploy to a configured Kubernetes cluster.</w:t>
+        <w:t>Publish the image to a registry and validate deployment on a remote or configured Kubernetes cluster.</w:t>
       </w:r>
     </w:p>
     <w:p>
@@ -2175,11 +2169,9 @@
     </w:p>
     <w:p>
       <w:r>
-        <w:t xml:space="preserve">The project demonstrates a practical MLOps workflow from dataset inspection and model </w:t>
-      </w:r>
-      <w:r>
-        <w:t>comparison through experiment tracking, API serving, testing, CI, and container packaging. The selected Random Forest pipeline achieved the recorded comparison metrics and was successfully served by the FastAPI application in Docker Compose. The repository includes Kubernetes manifests for a future cluster deployment, while the report distinguishes configuration from a deployment that has actually been executed.</w:t>
-      </w:r>
+        <w:t>The project demonstrates a practical MLOps workflow from dataset inspection and model comparison through experiment tracking, API serving, testing, CI, and container packaging. The selected Random Forest pipeline achieved the recorded comparison metrics and was successfully served by the FastAPI application in Docker Compose. The application was also deployed and validated on a local Minikube Kubernetes cluster. A production or remote-cluster deployment has not been claimed.</w:t>
+      </w:r>
+      <w:r/>
     </w:p>
     <w:p>
       <w:pPr>

</xml_diff>

<commit_message>
Add final deployment evidence and update assignment report
</commit_message>
<xml_diff>
--- a/MLOps_Assignment_Report.docx
+++ b/MLOps_Assignment_Report.docx
@@ -4,33 +4,79 @@
   <w:body>
     <w:p>
       <w:pPr>
+        <w:spacing w:before="240"/>
         <w:jc w:val="center"/>
       </w:pPr>
       <w:r>
         <w:rPr>
           <w:b/>
-          <w:sz w:val="48"/>
+          <w:color w:val="1F4E79"/>
+          <w:sz w:val="58"/>
         </w:rPr>
-        <w:t xml:space="preserve">MLOps Assignment </w:t>
-      </w:r>
-    </w:p>
-    <w:p>
-      <w:pPr>
-        <w:jc w:val="center"/>
-      </w:pPr>
+        <w:t>MLOps</w:t>
+      </w:r>
+      <w:r>
+        <w:t xml:space="preserve"> </w:t>
+      </w:r>
       <w:r>
         <w:rPr>
           <w:b/>
+          <w:color w:val="1F4E79"/>
+          <w:sz w:val="58"/>
+        </w:rPr>
+        <w:t>Assignment</w:t>
+      </w:r>
+      <w:r>
+        <w:t xml:space="preserve"> </w:t>
+      </w:r>
+    </w:p>
+    <w:p>
+      <w:pPr>
+        <w:spacing w:before="240"/>
+        <w:jc w:val="center"/>
+      </w:pPr>
+      <w:r>
+        <w:rPr>
+          <w:b/>
+          <w:sz w:val="44"/>
+          <w:szCs w:val="14"/>
+        </w:rPr>
+        <w:t>HEART DISEASE</w:t>
+      </w:r>
+      <w:r>
+        <w:rPr>
+          <w:b/>
+          <w:sz w:val="44"/>
+          <w:szCs w:val="14"/>
+        </w:rPr>
+        <w:t xml:space="preserve"> </w:t>
+      </w:r>
+      <w:r>
+        <w:rPr>
+          <w:b/>
+          <w:sz w:val="44"/>
+          <w:szCs w:val="14"/>
+        </w:rPr>
+        <w:t>CLASSIFICATION</w:t>
+      </w:r>
+    </w:p>
+    <w:p>
+      <w:pPr>
+        <w:jc w:val="center"/>
+        <w:rPr>
+          <w:color w:val="A7C6F1"/>
+        </w:rPr>
+      </w:pPr>
+      <w:r>
+        <w:rPr>
+          <w:b/>
+          <w:color w:val="A7C6F1"/>
           <w:sz w:val="34"/>
         </w:rPr>
-        <w:t>Heart Disease Classification Pipeline</w:t>
-      </w:r>
-    </w:p>
-    <w:p>
-      <w:r>
-        <w:br/>
-      </w:r>
-    </w:p>
+        <w:t>An End-to-End MLOps Pipeline</w:t>
+      </w:r>
+    </w:p>
+    <w:p/>
     <w:tbl>
       <w:tblPr>
         <w:tblStyle w:val="LightShading-Accent1"/>
@@ -38,8 +84,8 @@
         <w:tblLook w:val="04A0" w:firstRow="1" w:lastRow="0" w:firstColumn="1" w:lastColumn="0" w:noHBand="0" w:noVBand="1"/>
       </w:tblPr>
       <w:tblGrid>
-        <w:gridCol w:w="4968"/>
-        <w:gridCol w:w="4968"/>
+        <w:gridCol w:w="5040"/>
+        <w:gridCol w:w="5040"/>
       </w:tblGrid>
       <w:tr>
         <w:trPr>
@@ -48,270 +94,34 @@
         <w:tc>
           <w:tcPr>
             <w:cnfStyle w:val="001000000000" w:firstRow="0" w:lastRow="0" w:firstColumn="1" w:lastColumn="0" w:oddVBand="0" w:evenVBand="0" w:oddHBand="0" w:evenHBand="0" w:firstRowFirstColumn="0" w:firstRowLastColumn="0" w:lastRowFirstColumn="0" w:lastRowLastColumn="0"/>
-            <w:tcW w:w="4968" w:type="dxa"/>
+            <w:tcW w:w="5040" w:type="dxa"/>
           </w:tcPr>
           <w:p>
+            <w:pPr>
+              <w:spacing w:after="0"/>
+            </w:pPr>
             <w:r>
-              <w:t>Prepared</w:t>
-            </w:r>
-            <w:r>
-              <w:t xml:space="preserve"> </w:t>
-            </w:r>
-            <w:r>
-              <w:t>By:</w:t>
+              <w:rPr>
+                <w:sz w:val="16"/>
+              </w:rPr>
+              <w:t>Report details</w:t>
             </w:r>
           </w:p>
         </w:tc>
         <w:tc>
           <w:tcPr>
-            <w:tcW w:w="4968" w:type="dxa"/>
+            <w:tcW w:w="5040" w:type="dxa"/>
           </w:tcPr>
           <w:p>
             <w:pPr>
-              <w:cnfStyle w:val="100000000000" w:firstRow="1" w:lastRow="0" w:firstColumn="0" w:lastColumn="0" w:oddVBand="0" w:evenVBand="0" w:oddHBand="0" w:evenHBand="0" w:firstRowFirstColumn="0" w:firstRowLastColumn="0" w:lastRowFirstColumn="0" w:lastRowLastColumn="0"/>
-            </w:pPr>
-          </w:p>
-        </w:tc>
-      </w:tr>
-      <w:tr>
-        <w:trPr>
-          <w:cnfStyle w:val="000000100000" w:firstRow="0" w:lastRow="0" w:firstColumn="0" w:lastColumn="0" w:oddVBand="0" w:evenVBand="0" w:oddHBand="1" w:evenHBand="0" w:firstRowFirstColumn="0" w:firstRowLastColumn="0" w:lastRowFirstColumn="0" w:lastRowLastColumn="0"/>
-        </w:trPr>
-        <w:tc>
-          <w:tcPr>
-            <w:cnfStyle w:val="001000000000" w:firstRow="0" w:lastRow="0" w:firstColumn="1" w:lastColumn="0" w:oddVBand="0" w:evenVBand="0" w:oddHBand="0" w:evenHBand="0" w:firstRowFirstColumn="0" w:firstRowLastColumn="0" w:lastRowFirstColumn="0" w:lastRowLastColumn="0"/>
-            <w:tcW w:w="4968" w:type="dxa"/>
-          </w:tcPr>
-          <w:p>
-            <w:r>
-              <w:t>N</w:t>
-            </w:r>
-            <w:r>
-              <w:t>ame</w:t>
-            </w:r>
-          </w:p>
-        </w:tc>
-        <w:tc>
-          <w:tcPr>
-            <w:tcW w:w="4968" w:type="dxa"/>
-          </w:tcPr>
-          <w:p>
-            <w:pPr>
-              <w:cnfStyle w:val="000000100000" w:firstRow="0" w:lastRow="0" w:firstColumn="0" w:lastColumn="0" w:oddVBand="0" w:evenVBand="0" w:oddHBand="1" w:evenHBand="0" w:firstRowFirstColumn="0" w:firstRowLastColumn="0" w:lastRowFirstColumn="0" w:lastRowLastColumn="0"/>
-            </w:pPr>
-            <w:r>
-              <w:t>Jyoti Kumari</w:t>
-            </w:r>
-          </w:p>
-        </w:tc>
-      </w:tr>
-      <w:tr>
-        <w:tc>
-          <w:tcPr>
-            <w:cnfStyle w:val="001000000000" w:firstRow="0" w:lastRow="0" w:firstColumn="1" w:lastColumn="0" w:oddVBand="0" w:evenVBand="0" w:oddHBand="0" w:evenHBand="0" w:firstRowFirstColumn="0" w:firstRowLastColumn="0" w:lastRowFirstColumn="0" w:lastRowLastColumn="0"/>
-            <w:tcW w:w="4968" w:type="dxa"/>
-          </w:tcPr>
-          <w:p>
-            <w:r>
-              <w:t>Roll Number</w:t>
-            </w:r>
-          </w:p>
-        </w:tc>
-        <w:tc>
-          <w:tcPr>
-            <w:tcW w:w="4968" w:type="dxa"/>
-          </w:tcPr>
-          <w:p>
-            <w:pPr>
-              <w:cnfStyle w:val="000000000000" w:firstRow="0" w:lastRow="0" w:firstColumn="0" w:lastColumn="0" w:oddVBand="0" w:evenVBand="0" w:oddHBand="0" w:evenHBand="0" w:firstRowFirstColumn="0" w:firstRowLastColumn="0" w:lastRowFirstColumn="0" w:lastRowLastColumn="0"/>
-            </w:pPr>
-            <w:r>
-              <w:t>2025AE05237</w:t>
-            </w:r>
-          </w:p>
-        </w:tc>
-      </w:tr>
-    </w:tbl>
-    <w:p/>
-    <w:p>
-      <w:pPr>
-        <w:pStyle w:val="Heading2"/>
-      </w:pPr>
-      <w:r>
-        <w:t>Project summary</w:t>
-      </w:r>
-    </w:p>
-    <w:p>
-      <w:r>
-        <w:t>This project demonstrates an end-to-end machine-learning workflow for a binary heart-disease classification task using the Cleveland heart-disease dataset. It covers data inspection and exploratory analysis, preprocessing and model comparison, experiment tracking with MLflow, a FastAPI inference service, automated tests, continuous integration, and container packaging with Docker and Docker Compose. The API was also deployed and validated on a local Minikube Kubernetes cluster. This local validation does not represent a production or externally accessible cluster deployment.</w:t>
-      </w:r>
-      <w:r/>
-    </w:p>
-    <w:p>
-      <w:pPr>
-        <w:pStyle w:val="Heading2"/>
-      </w:pPr>
-      <w:r>
-        <w:t>Reproducibility note</w:t>
-      </w:r>
-    </w:p>
-    <w:p>
-      <w:r>
-        <w:t>Reported metrics and observed API outputs in this report are based on the project logs supplied during development. Before submission, confirm that the repository copy of this report matches the final code and that screenshots/video show the final version.</w:t>
-      </w:r>
-    </w:p>
-    <w:p>
-      <w:r>
-        <w:br w:type="page"/>
-      </w:r>
-    </w:p>
-    <w:p>
-      <w:pPr>
-        <w:pStyle w:val="Heading1"/>
-      </w:pPr>
-      <w:r>
-        <w:lastRenderedPageBreak/>
-        <w:t>1. Introduction and Objectives</w:t>
-      </w:r>
-    </w:p>
-    <w:p>
-      <w:r>
-        <w:t>Machine-learning projects require more than fitting a model. A usable solution needs a repeatable data workflow, an evaluation process, a way to package and serve predictions, and checks that reduce the risk of regressions when code changes. This assignment applies those practices to a binary classification problem.</w:t>
-      </w:r>
-    </w:p>
-    <w:p>
-      <w:pPr>
-        <w:pStyle w:val="Heading2"/>
-      </w:pPr>
-      <w:r>
-        <w:t>1.1 Problem statement</w:t>
-      </w:r>
-    </w:p>
-    <w:p>
-      <w:r>
-        <w:t>The task is to build a classifier that maps a set of patient measurements and categorical clinical attributes to a binary target. The API exposes the trained pipeline as a JSON endpoint. The project is educational and is not intended for clinical use.</w:t>
-      </w:r>
-    </w:p>
-    <w:p>
-      <w:pPr>
-        <w:pStyle w:val="Heading2"/>
-      </w:pPr>
-      <w:r>
-        <w:t>1.2 Objectives</w:t>
-      </w:r>
-    </w:p>
-    <w:p>
-      <w:pPr>
-        <w:pStyle w:val="ListBullet"/>
-      </w:pPr>
-      <w:r>
-        <w:t>Inspect the dataset, understand feature types, missing values, and target balance.</w:t>
-      </w:r>
-    </w:p>
-    <w:p>
-      <w:pPr>
-        <w:pStyle w:val="ListBullet"/>
-      </w:pPr>
-      <w:r>
-        <w:t>Prepare a reproducible preprocessing and training workflow.</w:t>
-      </w:r>
-    </w:p>
-    <w:p>
-      <w:pPr>
-        <w:pStyle w:val="ListBullet"/>
-      </w:pPr>
-      <w:r>
-        <w:t>Compare Logistic Regression and Random Forest using multiple evaluation metrics.</w:t>
-      </w:r>
-    </w:p>
-    <w:p>
-      <w:pPr>
-        <w:pStyle w:val="ListBullet"/>
-      </w:pPr>
-      <w:r>
-        <w:t>Record experiments and model metrics with MLflow.</w:t>
-      </w:r>
-    </w:p>
-    <w:p>
-      <w:pPr>
-        <w:pStyle w:val="ListBullet"/>
-      </w:pPr>
-      <w:r>
-        <w:t>Serve predictions through a validated FastAPI endpoint.</w:t>
-      </w:r>
-    </w:p>
-    <w:p>
-      <w:pPr>
-        <w:pStyle w:val="ListBullet"/>
-      </w:pPr>
-      <w:r>
-        <w:t>Automate basic quality checks with pytest, Ruff, and GitHub Actions.</w:t>
-      </w:r>
-    </w:p>
-    <w:p>
-      <w:pPr>
-        <w:pStyle w:val="ListBullet"/>
-      </w:pPr>
-      <w:r>
-        <w:t>Package the API in Docker and provide Docker Compose and Kubernetes deployment configuration.</w:t>
-      </w:r>
-    </w:p>
-    <w:p>
-      <w:pPr>
-        <w:pStyle w:val="Heading2"/>
-      </w:pPr>
-      <w:r>
-        <w:t>1.3 Project architecture</w:t>
-      </w:r>
-    </w:p>
-    <w:p>
-      <w:r>
-        <w:t>Raw dataset → inspection and EDA → preprocessing pipeline → model training and comparison → selected serialized pipeline → FastAPI (/health and /predict) → Docker image / Docker Compose. GitHub Actions runs lint, formatting, and tests when changes are pushed or proposed through a pull request.</w:t>
-      </w:r>
-    </w:p>
-    <w:p>
-      <w:pPr>
-        <w:pStyle w:val="Heading2"/>
-      </w:pPr>
-      <w:r>
-        <w:t>1.4 Tools</w:t>
-      </w:r>
-    </w:p>
-    <w:tbl>
-      <w:tblPr>
-        <w:tblStyle w:val="LightShading-Accent1"/>
-        <w:tblW w:w="0" w:type="auto"/>
-        <w:tblLook w:val="04A0" w:firstRow="1" w:lastRow="0" w:firstColumn="1" w:lastColumn="0" w:noHBand="0" w:noVBand="1"/>
-      </w:tblPr>
-      <w:tblGrid>
-        <w:gridCol w:w="4968"/>
-        <w:gridCol w:w="4968"/>
-      </w:tblGrid>
-      <w:tr>
-        <w:trPr>
-          <w:cnfStyle w:val="100000000000" w:firstRow="1" w:lastRow="0" w:firstColumn="0" w:lastColumn="0" w:oddVBand="0" w:evenVBand="0" w:oddHBand="0" w:evenHBand="0" w:firstRowFirstColumn="0" w:firstRowLastColumn="0" w:lastRowFirstColumn="0" w:lastRowLastColumn="0"/>
-        </w:trPr>
-        <w:tc>
-          <w:tcPr>
-            <w:cnfStyle w:val="001000000000" w:firstRow="0" w:lastRow="0" w:firstColumn="1" w:lastColumn="0" w:oddVBand="0" w:evenVBand="0" w:oddHBand="0" w:evenHBand="0" w:firstRowFirstColumn="0" w:firstRowLastColumn="0" w:lastRowFirstColumn="0" w:lastRowLastColumn="0"/>
-            <w:tcW w:w="4968" w:type="dxa"/>
-          </w:tcPr>
-          <w:p>
-            <w:r>
-              <w:t>Area</w:t>
-            </w:r>
-          </w:p>
-        </w:tc>
-        <w:tc>
-          <w:tcPr>
-            <w:tcW w:w="4968" w:type="dxa"/>
-          </w:tcPr>
-          <w:p>
-            <w:pPr>
+              <w:spacing w:after="0"/>
               <w:cnfStyle w:val="100000000000" w:firstRow="1" w:lastRow="0" w:firstColumn="0" w:lastColumn="0" w:oddVBand="0" w:evenVBand="0" w:oddHBand="0" w:evenHBand="0" w:firstRowFirstColumn="0" w:firstRowLastColumn="0" w:lastRowFirstColumn="0" w:lastRowLastColumn="0"/>
             </w:pPr>
             <w:r>
-              <w:t>Tools</w:t>
+              <w:rPr>
+                <w:sz w:val="16"/>
+              </w:rPr>
+              <w:t>Information</w:t>
             </w:r>
           </w:p>
         </w:tc>
@@ -323,24 +133,34 @@
         <w:tc>
           <w:tcPr>
             <w:cnfStyle w:val="001000000000" w:firstRow="0" w:lastRow="0" w:firstColumn="1" w:lastColumn="0" w:oddVBand="0" w:evenVBand="0" w:oddHBand="0" w:evenHBand="0" w:firstRowFirstColumn="0" w:firstRowLastColumn="0" w:lastRowFirstColumn="0" w:lastRowLastColumn="0"/>
-            <w:tcW w:w="4968" w:type="dxa"/>
+            <w:tcW w:w="5040" w:type="dxa"/>
           </w:tcPr>
           <w:p>
+            <w:pPr>
+              <w:spacing w:after="0"/>
+            </w:pPr>
             <w:r>
-              <w:t>Language and data</w:t>
+              <w:rPr>
+                <w:sz w:val="16"/>
+              </w:rPr>
+              <w:t>Project</w:t>
             </w:r>
           </w:p>
         </w:tc>
         <w:tc>
           <w:tcPr>
-            <w:tcW w:w="4968" w:type="dxa"/>
+            <w:tcW w:w="5040" w:type="dxa"/>
           </w:tcPr>
           <w:p>
             <w:pPr>
+              <w:spacing w:after="0"/>
               <w:cnfStyle w:val="000000100000" w:firstRow="0" w:lastRow="0" w:firstColumn="0" w:lastColumn="0" w:oddVBand="0" w:evenVBand="0" w:oddHBand="1" w:evenHBand="0" w:firstRowFirstColumn="0" w:firstRowLastColumn="0" w:lastRowFirstColumn="0" w:lastRowLastColumn="0"/>
             </w:pPr>
             <w:r>
-              <w:t>Python, pandas, NumPy</w:t>
+              <w:rPr>
+                <w:sz w:val="16"/>
+              </w:rPr>
+              <w:t>Heart disease classification using the Cleveland dataset</w:t>
             </w:r>
           </w:p>
         </w:tc>
@@ -349,24 +169,34 @@
         <w:tc>
           <w:tcPr>
             <w:cnfStyle w:val="001000000000" w:firstRow="0" w:lastRow="0" w:firstColumn="1" w:lastColumn="0" w:oddVBand="0" w:evenVBand="0" w:oddHBand="0" w:evenHBand="0" w:firstRowFirstColumn="0" w:firstRowLastColumn="0" w:lastRowFirstColumn="0" w:lastRowLastColumn="0"/>
-            <w:tcW w:w="4968" w:type="dxa"/>
+            <w:tcW w:w="5040" w:type="dxa"/>
           </w:tcPr>
           <w:p>
+            <w:pPr>
+              <w:spacing w:after="0"/>
+            </w:pPr>
             <w:r>
-              <w:t>Machine learning</w:t>
+              <w:rPr>
+                <w:sz w:val="16"/>
+              </w:rPr>
+              <w:t>Candidate models</w:t>
             </w:r>
           </w:p>
         </w:tc>
         <w:tc>
           <w:tcPr>
-            <w:tcW w:w="4968" w:type="dxa"/>
+            <w:tcW w:w="5040" w:type="dxa"/>
           </w:tcPr>
           <w:p>
             <w:pPr>
+              <w:spacing w:after="0"/>
               <w:cnfStyle w:val="000000000000" w:firstRow="0" w:lastRow="0" w:firstColumn="0" w:lastColumn="0" w:oddVBand="0" w:evenVBand="0" w:oddHBand="0" w:evenHBand="0" w:firstRowFirstColumn="0" w:firstRowLastColumn="0" w:lastRowFirstColumn="0" w:lastRowLastColumn="0"/>
             </w:pPr>
             <w:r>
-              <w:t>scikit-learn, joblib</w:t>
+              <w:rPr>
+                <w:sz w:val="16"/>
+              </w:rPr>
+              <w:t>Logistic Regression and Random Forest</w:t>
             </w:r>
           </w:p>
         </w:tc>
@@ -378,24 +208,40 @@
         <w:tc>
           <w:tcPr>
             <w:cnfStyle w:val="001000000000" w:firstRow="0" w:lastRow="0" w:firstColumn="1" w:lastColumn="0" w:oddVBand="0" w:evenVBand="0" w:oddHBand="0" w:evenHBand="0" w:firstRowFirstColumn="0" w:firstRowLastColumn="0" w:lastRowFirstColumn="0" w:lastRowLastColumn="0"/>
-            <w:tcW w:w="4968" w:type="dxa"/>
+            <w:tcW w:w="5040" w:type="dxa"/>
           </w:tcPr>
           <w:p>
+            <w:pPr>
+              <w:spacing w:after="0"/>
+            </w:pPr>
             <w:r>
-              <w:t>Experiment tracking</w:t>
+              <w:rPr>
+                <w:sz w:val="16"/>
+              </w:rPr>
+              <w:t xml:space="preserve">Experiment </w:t>
+            </w:r>
+            <w:r>
+              <w:rPr>
+                <w:sz w:val="16"/>
+              </w:rPr>
+              <w:t>tracking</w:t>
             </w:r>
           </w:p>
         </w:tc>
         <w:tc>
           <w:tcPr>
-            <w:tcW w:w="4968" w:type="dxa"/>
+            <w:tcW w:w="5040" w:type="dxa"/>
           </w:tcPr>
           <w:p>
             <w:pPr>
+              <w:spacing w:after="0"/>
               <w:cnfStyle w:val="000000100000" w:firstRow="0" w:lastRow="0" w:firstColumn="0" w:lastColumn="0" w:oddVBand="0" w:evenVBand="0" w:oddHBand="1" w:evenHBand="0" w:firstRowFirstColumn="0" w:firstRowLastColumn="0" w:lastRowFirstColumn="0" w:lastRowLastColumn="0"/>
             </w:pPr>
             <w:r>
-              <w:t>MLflow with SQLite backend</w:t>
+              <w:rPr>
+                <w:sz w:val="16"/>
+              </w:rPr>
+              <w:t>MLflow with SQLite tracking store</w:t>
             </w:r>
           </w:p>
         </w:tc>
@@ -404,24 +250,34 @@
         <w:tc>
           <w:tcPr>
             <w:cnfStyle w:val="001000000000" w:firstRow="0" w:lastRow="0" w:firstColumn="1" w:lastColumn="0" w:oddVBand="0" w:evenVBand="0" w:oddHBand="0" w:evenHBand="0" w:firstRowFirstColumn="0" w:firstRowLastColumn="0" w:lastRowFirstColumn="0" w:lastRowLastColumn="0"/>
-            <w:tcW w:w="4968" w:type="dxa"/>
+            <w:tcW w:w="5040" w:type="dxa"/>
           </w:tcPr>
           <w:p>
+            <w:pPr>
+              <w:spacing w:after="0"/>
+            </w:pPr>
             <w:r>
-              <w:t>API</w:t>
+              <w:rPr>
+                <w:sz w:val="16"/>
+              </w:rPr>
+              <w:t>Inference interface</w:t>
             </w:r>
           </w:p>
         </w:tc>
         <w:tc>
           <w:tcPr>
-            <w:tcW w:w="4968" w:type="dxa"/>
+            <w:tcW w:w="5040" w:type="dxa"/>
           </w:tcPr>
           <w:p>
             <w:pPr>
+              <w:spacing w:after="0"/>
               <w:cnfStyle w:val="000000000000" w:firstRow="0" w:lastRow="0" w:firstColumn="0" w:lastColumn="0" w:oddVBand="0" w:evenVBand="0" w:oddHBand="0" w:evenHBand="0" w:firstRowFirstColumn="0" w:firstRowLastColumn="0" w:lastRowFirstColumn="0" w:lastRowLastColumn="0"/>
             </w:pPr>
             <w:r>
-              <w:t>FastAPI, Uvicorn</w:t>
+              <w:rPr>
+                <w:sz w:val="16"/>
+              </w:rPr>
+              <w:t>REST API implemented with FastAPI</w:t>
             </w:r>
           </w:p>
         </w:tc>
@@ -433,23 +289,33 @@
         <w:tc>
           <w:tcPr>
             <w:cnfStyle w:val="001000000000" w:firstRow="0" w:lastRow="0" w:firstColumn="1" w:lastColumn="0" w:oddVBand="0" w:evenVBand="0" w:oddHBand="0" w:evenHBand="0" w:firstRowFirstColumn="0" w:firstRowLastColumn="0" w:lastRowFirstColumn="0" w:lastRowLastColumn="0"/>
-            <w:tcW w:w="4968" w:type="dxa"/>
+            <w:tcW w:w="5040" w:type="dxa"/>
           </w:tcPr>
           <w:p>
+            <w:pPr>
+              <w:spacing w:after="0"/>
+            </w:pPr>
             <w:r>
-              <w:t>Quality</w:t>
+              <w:rPr>
+                <w:sz w:val="16"/>
+              </w:rPr>
+              <w:t>Quality and CI</w:t>
             </w:r>
           </w:p>
         </w:tc>
         <w:tc>
           <w:tcPr>
-            <w:tcW w:w="4968" w:type="dxa"/>
+            <w:tcW w:w="5040" w:type="dxa"/>
           </w:tcPr>
           <w:p>
             <w:pPr>
+              <w:spacing w:after="0"/>
               <w:cnfStyle w:val="000000100000" w:firstRow="0" w:lastRow="0" w:firstColumn="0" w:lastColumn="0" w:oddVBand="0" w:evenVBand="0" w:oddHBand="1" w:evenHBand="0" w:firstRowFirstColumn="0" w:firstRowLastColumn="0" w:lastRowFirstColumn="0" w:lastRowLastColumn="0"/>
             </w:pPr>
             <w:r>
+              <w:rPr>
+                <w:sz w:val="16"/>
+              </w:rPr>
               <w:t>pytest, Ruff, GitHub Actions</w:t>
             </w:r>
           </w:p>
@@ -459,31 +325,87 @@
         <w:tc>
           <w:tcPr>
             <w:cnfStyle w:val="001000000000" w:firstRow="0" w:lastRow="0" w:firstColumn="1" w:lastColumn="0" w:oddVBand="0" w:evenVBand="0" w:oddHBand="0" w:evenHBand="0" w:firstRowFirstColumn="0" w:firstRowLastColumn="0" w:lastRowFirstColumn="0" w:lastRowLastColumn="0"/>
-            <w:tcW w:w="4968" w:type="dxa"/>
+            <w:tcW w:w="5040" w:type="dxa"/>
           </w:tcPr>
           <w:p>
+            <w:pPr>
+              <w:spacing w:after="0"/>
+            </w:pPr>
             <w:r>
-              <w:t>Packaging</w:t>
+              <w:rPr>
+                <w:sz w:val="16"/>
+              </w:rPr>
+              <w:t>Repository</w:t>
             </w:r>
           </w:p>
         </w:tc>
         <w:tc>
           <w:tcPr>
-            <w:tcW w:w="4968" w:type="dxa"/>
+            <w:tcW w:w="5040" w:type="dxa"/>
           </w:tcPr>
           <w:p>
             <w:pPr>
+              <w:spacing w:after="0"/>
               <w:cnfStyle w:val="000000000000" w:firstRow="0" w:lastRow="0" w:firstColumn="0" w:lastColumn="0" w:oddVBand="0" w:evenVBand="0" w:oddHBand="0" w:evenHBand="0" w:firstRowFirstColumn="0" w:firstRowLastColumn="0" w:lastRowFirstColumn="0" w:lastRowLastColumn="0"/>
             </w:pPr>
             <w:r>
-              <w:t>Docker, Docker Compose</w:t>
+              <w:rPr>
+                <w:sz w:val="16"/>
+              </w:rPr>
+              <w:t>https://github.com/Jyoti2025BITS/heart-disease-mlops</w:t>
             </w:r>
           </w:p>
         </w:tc>
       </w:tr>
     </w:tbl>
-    <w:p/>
-    <w:p>
+    <w:p>
+      <w:pPr>
+        <w:ind w:left="7200"/>
+      </w:pPr>
+    </w:p>
+    <w:p>
+      <w:pPr>
+        <w:ind w:left="7200"/>
+      </w:pPr>
+      <w:r>
+        <w:rPr>
+          <w:i/>
+        </w:rPr>
+        <w:t xml:space="preserve">Prepared </w:t>
+      </w:r>
+      <w:r>
+        <w:rPr>
+          <w:i/>
+        </w:rPr>
+        <w:t>By:</w:t>
+      </w:r>
+    </w:p>
+    <w:p>
+      <w:pPr>
+        <w:ind w:left="7200"/>
+      </w:pPr>
+      <w:r>
+        <w:t>N</w:t>
+      </w:r>
+      <w:r>
+        <w:t>ame: Jyoti Kumari</w:t>
+      </w:r>
+    </w:p>
+    <w:p>
+      <w:pPr>
+        <w:ind w:left="7200"/>
+      </w:pPr>
+      <w:r>
+        <w:t>Roll Number:</w:t>
+      </w:r>
+      <w:r>
+        <w:t xml:space="preserve"> 2025AE05237 </w:t>
+      </w:r>
+    </w:p>
+    <w:p>
+      <w:pPr>
+        <w:ind w:left="7200"/>
+      </w:pPr>
       <w:r>
         <w:br w:type="page"/>
       </w:r>
@@ -494,15 +416,17 @@
       </w:pPr>
       <w:r>
         <w:lastRenderedPageBreak/>
-        <w:t>2. Dataset and Data Quality</w:t>
-      </w:r>
-    </w:p>
-    <w:p>
-      <w:r>
-        <w:t xml:space="preserve">The project uses the Cleveland </w:t>
-      </w:r>
-      <w:r>
-        <w:t>heart-disease dataset file stored in the repository at data/raw/processed.cleveland.data. During development, the dataset was inspected as 303 observations with 14 original attributes before the binary target was added, yielding 15 columns in the processed view.</w:t>
+        <w:t>Abstract and Project Overview</w:t>
+      </w:r>
+    </w:p>
+    <w:p>
+      <w:r>
+        <w:t>This report documents an end-to-end machine learning operations (MLOps) project for binary classification using the Cleveland heart disease dataset. The workflow combines data inspection, exploratory data analysis (EDA), model training and comparison, experiment tracking, model persistence, REST API inference, automated testing, and continuous integration.</w:t>
+      </w:r>
+    </w:p>
+    <w:p>
+      <w:r>
+        <w:t>The project compares Logistic Regression and Random Forest using accuracy, precision, recall, and ROC-AUC. In the recorded results, both achieved 83.49% accuracy. Random Forest achieved a slightly higher ROC-AUC (0.9125) than Logistic Regression (0.9099) and was selected based on the recorded comparison.</w:t>
       </w:r>
     </w:p>
     <w:p>
@@ -510,7 +434,190 @@
         <w:pStyle w:val="Heading2"/>
       </w:pPr>
       <w:r>
-        <w:t>2.1 Missing values</w:t>
+        <w:t>Objectives</w:t>
+      </w:r>
+    </w:p>
+    <w:p>
+      <w:pPr>
+        <w:pStyle w:val="ListBullet"/>
+        <w:spacing w:after="20"/>
+      </w:pPr>
+      <w:r>
+        <w:t>Inspect dataset structure, target distribution, and missing values.</w:t>
+      </w:r>
+    </w:p>
+    <w:p>
+      <w:pPr>
+        <w:pStyle w:val="ListBullet"/>
+        <w:spacing w:after="20"/>
+      </w:pPr>
+      <w:r>
+        <w:t>Generate EDA plots to understand the data.</w:t>
+      </w:r>
+    </w:p>
+    <w:p>
+      <w:pPr>
+        <w:pStyle w:val="ListBullet"/>
+        <w:spacing w:after="20"/>
+      </w:pPr>
+      <w:r>
+        <w:t>Train and compare two classification algorithms using consistent metrics.</w:t>
+      </w:r>
+    </w:p>
+    <w:p>
+      <w:pPr>
+        <w:pStyle w:val="ListBullet"/>
+        <w:spacing w:after="20"/>
+      </w:pPr>
+      <w:r>
+        <w:t>Record experiment results in MLflow and preserve model artifacts.</w:t>
+      </w:r>
+    </w:p>
+    <w:p>
+      <w:pPr>
+        <w:pStyle w:val="ListBullet"/>
+        <w:spacing w:after="20"/>
+      </w:pPr>
+      <w:r>
+        <w:t>Expose the selected model through a REST API.</w:t>
+      </w:r>
+    </w:p>
+    <w:p>
+      <w:pPr>
+        <w:pStyle w:val="ListBullet"/>
+        <w:spacing w:after="20"/>
+      </w:pPr>
+      <w:r>
+        <w:t>Validate implementation with tests, linting, formatting, and GitHub Actions.</w:t>
+      </w:r>
+    </w:p>
+    <w:p>
+      <w:pPr>
+        <w:pStyle w:val="Heading2"/>
+      </w:pPr>
+      <w:r>
+        <w:t>Scope</w:t>
+      </w:r>
+    </w:p>
+    <w:p>
+      <w:r>
+        <w:t>The scope is an educational ML engineering workflow. It demonstrates project organization and delivery practices rather than a clinically validated diagnostic system. The model is not intended for patient care.</w:t>
+      </w:r>
+    </w:p>
+    <w:p>
+      <w:pPr>
+        <w:pStyle w:val="Heading2"/>
+      </w:pPr>
+      <w:r>
+        <w:t>Deliverables</w:t>
+      </w:r>
+    </w:p>
+    <w:p>
+      <w:pPr>
+        <w:pStyle w:val="ListBullet"/>
+        <w:spacing w:after="20"/>
+      </w:pPr>
+      <w:r>
+        <w:t>Source code and configuration in the Git repository.</w:t>
+      </w:r>
+    </w:p>
+    <w:p>
+      <w:pPr>
+        <w:pStyle w:val="ListBullet"/>
+        <w:spacing w:after="20"/>
+      </w:pPr>
+      <w:r>
+        <w:t>Dataset file and generated EDA plots.</w:t>
+      </w:r>
+    </w:p>
+    <w:p>
+      <w:pPr>
+        <w:pStyle w:val="ListBullet"/>
+        <w:spacing w:after="20"/>
+      </w:pPr>
+      <w:r>
+        <w:t>Saved model artifacts and model-comparison report.</w:t>
+      </w:r>
+    </w:p>
+    <w:p>
+      <w:pPr>
+        <w:pStyle w:val="ListBullet"/>
+        <w:spacing w:after="20"/>
+      </w:pPr>
+      <w:r>
+        <w:t>MLflow experiment records.</w:t>
+      </w:r>
+    </w:p>
+    <w:p>
+      <w:pPr>
+        <w:pStyle w:val="ListBullet"/>
+        <w:spacing w:after="20"/>
+      </w:pPr>
+      <w:r>
+        <w:t xml:space="preserve">REST </w:t>
+      </w:r>
+      <w:r>
+        <w:t>API endpoints and tests.</w:t>
+      </w:r>
+    </w:p>
+    <w:p>
+      <w:pPr>
+        <w:pStyle w:val="ListBullet"/>
+        <w:spacing w:after="20"/>
+      </w:pPr>
+      <w:r>
+        <w:t>GitHub Actions workflow and this report.</w:t>
+      </w:r>
+    </w:p>
+    <w:p>
+      <w:r>
+        <w:br w:type="page"/>
+      </w:r>
+    </w:p>
+    <w:p>
+      <w:pPr>
+        <w:pStyle w:val="Heading1"/>
+      </w:pPr>
+      <w:r>
+        <w:lastRenderedPageBreak/>
+        <w:t>1. Problem Definition and Dataset</w:t>
+      </w:r>
+    </w:p>
+    <w:p>
+      <w:pPr>
+        <w:pStyle w:val="Heading2"/>
+      </w:pPr>
+      <w:r>
+        <w:t>1.1 Problem statement</w:t>
+      </w:r>
+    </w:p>
+    <w:p>
+      <w:r>
+        <w:t>The task is to predict a binary target from structured clinical attributes. The pipeline accepts feature values and produces a predicted class. The model output is intended for demonstration and evaluation in an academic project.</w:t>
+      </w:r>
+    </w:p>
+    <w:p>
+      <w:pPr>
+        <w:pStyle w:val="Heading2"/>
+      </w:pPr>
+      <w:r>
+        <w:t>1.2 Dataset</w:t>
+      </w:r>
+    </w:p>
+    <w:p>
+      <w:r>
+        <w:t xml:space="preserve">The project uses the Cleveland heart disease dataset at data/raw/processed.cleveland.data. Recorded inspection showed 303 records. Initial </w:t>
+      </w:r>
+      <w:r>
+        <w:t>inspection reported 14 columns before target transformation; the processed view later contained 15 columns including the target.</w:t>
+      </w:r>
+    </w:p>
+    <w:p>
+      <w:pPr>
+        <w:pStyle w:val="Heading2"/>
+      </w:pPr>
+      <w:r>
+        <w:t>1.3 Target distribution</w:t>
       </w:r>
     </w:p>
     <w:tbl>
@@ -520,8 +627,9 @@
         <w:tblLook w:val="04A0" w:firstRow="1" w:lastRow="0" w:firstColumn="1" w:lastColumn="0" w:noHBand="0" w:noVBand="1"/>
       </w:tblPr>
       <w:tblGrid>
-        <w:gridCol w:w="4968"/>
-        <w:gridCol w:w="4968"/>
+        <w:gridCol w:w="3360"/>
+        <w:gridCol w:w="3360"/>
+        <w:gridCol w:w="3360"/>
       </w:tblGrid>
       <w:tr>
         <w:trPr>
@@ -530,24 +638,51 @@
         <w:tc>
           <w:tcPr>
             <w:cnfStyle w:val="001000000000" w:firstRow="0" w:lastRow="0" w:firstColumn="1" w:lastColumn="0" w:oddVBand="0" w:evenVBand="0" w:oddHBand="0" w:evenHBand="0" w:firstRowFirstColumn="0" w:firstRowLastColumn="0" w:lastRowFirstColumn="0" w:lastRowLastColumn="0"/>
-            <w:tcW w:w="4968" w:type="dxa"/>
+            <w:tcW w:w="3360" w:type="dxa"/>
           </w:tcPr>
           <w:p>
+            <w:pPr>
+              <w:spacing w:after="0"/>
+            </w:pPr>
             <w:r>
-              <w:t>Feature</w:t>
+              <w:rPr>
+                <w:sz w:val="16"/>
+              </w:rPr>
+              <w:t>Target class</w:t>
             </w:r>
           </w:p>
         </w:tc>
         <w:tc>
           <w:tcPr>
-            <w:tcW w:w="4968" w:type="dxa"/>
+            <w:tcW w:w="3360" w:type="dxa"/>
           </w:tcPr>
           <w:p>
             <w:pPr>
+              <w:spacing w:after="0"/>
               <w:cnfStyle w:val="100000000000" w:firstRow="1" w:lastRow="0" w:firstColumn="0" w:lastColumn="0" w:oddVBand="0" w:evenVBand="0" w:oddHBand="0" w:evenHBand="0" w:firstRowFirstColumn="0" w:firstRowLastColumn="0" w:lastRowFirstColumn="0" w:lastRowLastColumn="0"/>
             </w:pPr>
             <w:r>
-              <w:t>Missing observations reported</w:t>
+              <w:rPr>
+                <w:sz w:val="16"/>
+              </w:rPr>
+              <w:t>Records</w:t>
+            </w:r>
+          </w:p>
+        </w:tc>
+        <w:tc>
+          <w:tcPr>
+            <w:tcW w:w="3360" w:type="dxa"/>
+          </w:tcPr>
+          <w:p>
+            <w:pPr>
+              <w:spacing w:after="0"/>
+              <w:cnfStyle w:val="100000000000" w:firstRow="1" w:lastRow="0" w:firstColumn="0" w:lastColumn="0" w:oddVBand="0" w:evenVBand="0" w:oddHBand="0" w:evenHBand="0" w:firstRowFirstColumn="0" w:firstRowLastColumn="0" w:lastRowFirstColumn="0" w:lastRowLastColumn="0"/>
+            </w:pPr>
+            <w:r>
+              <w:rPr>
+                <w:sz w:val="16"/>
+              </w:rPr>
+              <w:t>Approx. share</w:t>
             </w:r>
           </w:p>
         </w:tc>
@@ -559,24 +694,51 @@
         <w:tc>
           <w:tcPr>
             <w:cnfStyle w:val="001000000000" w:firstRow="0" w:lastRow="0" w:firstColumn="1" w:lastColumn="0" w:oddVBand="0" w:evenVBand="0" w:oddHBand="0" w:evenHBand="0" w:firstRowFirstColumn="0" w:firstRowLastColumn="0" w:lastRowFirstColumn="0" w:lastRowLastColumn="0"/>
-            <w:tcW w:w="4968" w:type="dxa"/>
+            <w:tcW w:w="3360" w:type="dxa"/>
           </w:tcPr>
           <w:p>
+            <w:pPr>
+              <w:spacing w:after="0"/>
+            </w:pPr>
             <w:r>
-              <w:t>ca</w:t>
+              <w:rPr>
+                <w:sz w:val="16"/>
+              </w:rPr>
+              <w:t>0</w:t>
             </w:r>
           </w:p>
         </w:tc>
         <w:tc>
           <w:tcPr>
-            <w:tcW w:w="4968" w:type="dxa"/>
+            <w:tcW w:w="3360" w:type="dxa"/>
           </w:tcPr>
           <w:p>
             <w:pPr>
+              <w:spacing w:after="0"/>
               <w:cnfStyle w:val="000000100000" w:firstRow="0" w:lastRow="0" w:firstColumn="0" w:lastColumn="0" w:oddVBand="0" w:evenVBand="0" w:oddHBand="1" w:evenHBand="0" w:firstRowFirstColumn="0" w:firstRowLastColumn="0" w:lastRowFirstColumn="0" w:lastRowLastColumn="0"/>
             </w:pPr>
             <w:r>
-              <w:t>4</w:t>
+              <w:rPr>
+                <w:sz w:val="16"/>
+              </w:rPr>
+              <w:t>164</w:t>
+            </w:r>
+          </w:p>
+        </w:tc>
+        <w:tc>
+          <w:tcPr>
+            <w:tcW w:w="3360" w:type="dxa"/>
+          </w:tcPr>
+          <w:p>
+            <w:pPr>
+              <w:spacing w:after="0"/>
+              <w:cnfStyle w:val="000000100000" w:firstRow="0" w:lastRow="0" w:firstColumn="0" w:lastColumn="0" w:oddVBand="0" w:evenVBand="0" w:oddHBand="1" w:evenHBand="0" w:firstRowFirstColumn="0" w:firstRowLastColumn="0" w:lastRowFirstColumn="0" w:lastRowLastColumn="0"/>
+            </w:pPr>
+            <w:r>
+              <w:rPr>
+                <w:sz w:val="16"/>
+              </w:rPr>
+              <w:t>54.1%</w:t>
             </w:r>
           </w:p>
         </w:tc>
@@ -585,81 +747,51 @@
         <w:tc>
           <w:tcPr>
             <w:cnfStyle w:val="001000000000" w:firstRow="0" w:lastRow="0" w:firstColumn="1" w:lastColumn="0" w:oddVBand="0" w:evenVBand="0" w:oddHBand="0" w:evenHBand="0" w:firstRowFirstColumn="0" w:firstRowLastColumn="0" w:lastRowFirstColumn="0" w:lastRowLastColumn="0"/>
-            <w:tcW w:w="4968" w:type="dxa"/>
+            <w:tcW w:w="3360" w:type="dxa"/>
           </w:tcPr>
           <w:p>
+            <w:pPr>
+              <w:spacing w:after="0"/>
+            </w:pPr>
             <w:r>
-              <w:t>thal</w:t>
+              <w:rPr>
+                <w:sz w:val="16"/>
+              </w:rPr>
+              <w:t>1</w:t>
             </w:r>
           </w:p>
         </w:tc>
         <w:tc>
           <w:tcPr>
-            <w:tcW w:w="4968" w:type="dxa"/>
+            <w:tcW w:w="3360" w:type="dxa"/>
           </w:tcPr>
           <w:p>
             <w:pPr>
+              <w:spacing w:after="0"/>
               <w:cnfStyle w:val="000000000000" w:firstRow="0" w:lastRow="0" w:firstColumn="0" w:lastColumn="0" w:oddVBand="0" w:evenVBand="0" w:oddHBand="0" w:evenHBand="0" w:firstRowFirstColumn="0" w:firstRowLastColumn="0" w:lastRowFirstColumn="0" w:lastRowLastColumn="0"/>
             </w:pPr>
             <w:r>
-              <w:t>2</w:t>
-            </w:r>
-          </w:p>
-        </w:tc>
-      </w:tr>
-    </w:tbl>
-    <w:p/>
-    <w:p>
-      <w:r>
-        <w:t xml:space="preserve">Missingness is concentrated in the ca and thal fields in the supplied inspection output. A preprocessing pipeline should handle these values consistently at training and </w:t>
-      </w:r>
-      <w:r>
-        <w:t>inference time; any imputation strategy should be documented in the implementation.</w:t>
-      </w:r>
-    </w:p>
-    <w:p>
-      <w:pPr>
-        <w:pStyle w:val="Heading2"/>
-      </w:pPr>
-      <w:r>
-        <w:t>2.2 Target distribution</w:t>
-      </w:r>
-    </w:p>
-    <w:tbl>
-      <w:tblPr>
-        <w:tblStyle w:val="LightShading-Accent1"/>
-        <w:tblW w:w="0" w:type="auto"/>
-        <w:tblLook w:val="04A0" w:firstRow="1" w:lastRow="0" w:firstColumn="1" w:lastColumn="0" w:noHBand="0" w:noVBand="1"/>
-      </w:tblPr>
-      <w:tblGrid>
-        <w:gridCol w:w="4968"/>
-        <w:gridCol w:w="4968"/>
-      </w:tblGrid>
-      <w:tr>
-        <w:trPr>
-          <w:cnfStyle w:val="100000000000" w:firstRow="1" w:lastRow="0" w:firstColumn="0" w:lastColumn="0" w:oddVBand="0" w:evenVBand="0" w:oddHBand="0" w:evenHBand="0" w:firstRowFirstColumn="0" w:firstRowLastColumn="0" w:lastRowFirstColumn="0" w:lastRowLastColumn="0"/>
-        </w:trPr>
-        <w:tc>
-          <w:tcPr>
-            <w:cnfStyle w:val="001000000000" w:firstRow="0" w:lastRow="0" w:firstColumn="1" w:lastColumn="0" w:oddVBand="0" w:evenVBand="0" w:oddHBand="0" w:evenHBand="0" w:firstRowFirstColumn="0" w:firstRowLastColumn="0" w:lastRowFirstColumn="0" w:lastRowLastColumn="0"/>
-            <w:tcW w:w="4968" w:type="dxa"/>
-          </w:tcPr>
-          <w:p>
-            <w:r>
-              <w:t>Binary target</w:t>
+              <w:rPr>
+                <w:sz w:val="16"/>
+              </w:rPr>
+              <w:t>139</w:t>
             </w:r>
           </w:p>
         </w:tc>
         <w:tc>
           <w:tcPr>
-            <w:tcW w:w="4968" w:type="dxa"/>
+            <w:tcW w:w="3360" w:type="dxa"/>
           </w:tcPr>
           <w:p>
             <w:pPr>
-              <w:cnfStyle w:val="100000000000" w:firstRow="1" w:lastRow="0" w:firstColumn="0" w:lastColumn="0" w:oddVBand="0" w:evenVBand="0" w:oddHBand="0" w:evenHBand="0" w:firstRowFirstColumn="0" w:firstRowLastColumn="0" w:lastRowFirstColumn="0" w:lastRowLastColumn="0"/>
+              <w:spacing w:after="0"/>
+              <w:cnfStyle w:val="000000000000" w:firstRow="0" w:lastRow="0" w:firstColumn="0" w:lastColumn="0" w:oddVBand="0" w:evenVBand="0" w:oddHBand="0" w:evenHBand="0" w:firstRowFirstColumn="0" w:firstRowLastColumn="0" w:lastRowFirstColumn="0" w:lastRowLastColumn="0"/>
             </w:pPr>
             <w:r>
-              <w:t>Count</w:t>
+              <w:rPr>
+                <w:sz w:val="16"/>
+              </w:rPr>
+              <w:t>45.9%</w:t>
             </w:r>
           </w:p>
         </w:tc>
@@ -671,59 +803,62 @@
         <w:tc>
           <w:tcPr>
             <w:cnfStyle w:val="001000000000" w:firstRow="0" w:lastRow="0" w:firstColumn="1" w:lastColumn="0" w:oddVBand="0" w:evenVBand="0" w:oddHBand="0" w:evenHBand="0" w:firstRowFirstColumn="0" w:firstRowLastColumn="0" w:lastRowFirstColumn="0" w:lastRowLastColumn="0"/>
-            <w:tcW w:w="4968" w:type="dxa"/>
+            <w:tcW w:w="3360" w:type="dxa"/>
           </w:tcPr>
           <w:p>
+            <w:pPr>
+              <w:spacing w:after="0"/>
+            </w:pPr>
             <w:r>
-              <w:t>0</w:t>
+              <w:rPr>
+                <w:sz w:val="16"/>
+              </w:rPr>
+              <w:t>Total</w:t>
             </w:r>
           </w:p>
         </w:tc>
         <w:tc>
           <w:tcPr>
-            <w:tcW w:w="4968" w:type="dxa"/>
+            <w:tcW w:w="3360" w:type="dxa"/>
           </w:tcPr>
           <w:p>
             <w:pPr>
+              <w:spacing w:after="0"/>
               <w:cnfStyle w:val="000000100000" w:firstRow="0" w:lastRow="0" w:firstColumn="0" w:lastColumn="0" w:oddVBand="0" w:evenVBand="0" w:oddHBand="1" w:evenHBand="0" w:firstRowFirstColumn="0" w:firstRowLastColumn="0" w:lastRowFirstColumn="0" w:lastRowLastColumn="0"/>
             </w:pPr>
             <w:r>
-              <w:t>164</w:t>
-            </w:r>
-          </w:p>
-        </w:tc>
-      </w:tr>
-      <w:tr>
-        <w:tc>
-          <w:tcPr>
-            <w:cnfStyle w:val="001000000000" w:firstRow="0" w:lastRow="0" w:firstColumn="1" w:lastColumn="0" w:oddVBand="0" w:evenVBand="0" w:oddHBand="0" w:evenHBand="0" w:firstRowFirstColumn="0" w:firstRowLastColumn="0" w:lastRowFirstColumn="0" w:lastRowLastColumn="0"/>
-            <w:tcW w:w="4968" w:type="dxa"/>
-          </w:tcPr>
-          <w:p>
-            <w:r>
-              <w:t>1</w:t>
+              <w:rPr>
+                <w:sz w:val="16"/>
+              </w:rPr>
+              <w:t>303</w:t>
             </w:r>
           </w:p>
         </w:tc>
         <w:tc>
           <w:tcPr>
-            <w:tcW w:w="4968" w:type="dxa"/>
+            <w:tcW w:w="3360" w:type="dxa"/>
           </w:tcPr>
           <w:p>
             <w:pPr>
-              <w:cnfStyle w:val="000000000000" w:firstRow="0" w:lastRow="0" w:firstColumn="0" w:lastColumn="0" w:oddVBand="0" w:evenVBand="0" w:oddHBand="0" w:evenHBand="0" w:firstRowFirstColumn="0" w:firstRowLastColumn="0" w:lastRowFirstColumn="0" w:lastRowLastColumn="0"/>
+              <w:spacing w:after="0"/>
+              <w:cnfStyle w:val="000000100000" w:firstRow="0" w:lastRow="0" w:firstColumn="0" w:lastColumn="0" w:oddVBand="0" w:evenVBand="0" w:oddHBand="1" w:evenHBand="0" w:firstRowFirstColumn="0" w:firstRowLastColumn="0" w:lastRowFirstColumn="0" w:lastRowLastColumn="0"/>
             </w:pPr>
             <w:r>
-              <w:t>139</w:t>
+              <w:rPr>
+                <w:sz w:val="16"/>
+              </w:rPr>
+              <w:t>100%</w:t>
             </w:r>
           </w:p>
         </w:tc>
       </w:tr>
     </w:tbl>
-    <w:p/>
-    <w:p>
-      <w:r>
-        <w:t>The two classes are relatively close in size, although they are not exactly balanced. Accuracy alone is therefore not sufficient to describe model behaviour. Precision, recall, and ROC-AUC provide complementary views of classification quality.</w:t>
+    <w:p>
+      <w:r>
+        <w:t xml:space="preserve">The two classes are </w:t>
+      </w:r>
+      <w:r>
+        <w:t>relatively close in size, although not exactly balanced. The target-balance plot is stored under screenshots/eda/.</w:t>
       </w:r>
     </w:p>
     <w:p>
@@ -731,74 +866,7 @@
         <w:pStyle w:val="Heading2"/>
       </w:pPr>
       <w:r>
-        <w:t>2.3 Data handling considerations</w:t>
-      </w:r>
-    </w:p>
-    <w:p>
-      <w:pPr>
-        <w:pStyle w:val="ListBullet"/>
-      </w:pPr>
-      <w:r>
-        <w:t>Keep preprocessing fitted only on the training split to avoid leakage from the test data.</w:t>
-      </w:r>
-    </w:p>
-    <w:p>
-      <w:pPr>
-        <w:pStyle w:val="ListBullet"/>
-      </w:pPr>
-      <w:r>
-        <w:t>Use the same feature order and transformations during training and prediction.</w:t>
-      </w:r>
-    </w:p>
-    <w:p>
-      <w:pPr>
-        <w:pStyle w:val="ListBullet"/>
-      </w:pPr>
-      <w:r>
-        <w:t>Preserve the dataset source and provide download instructions if redistribution is restricted.</w:t>
-      </w:r>
-    </w:p>
-    <w:p>
-      <w:pPr>
-        <w:pStyle w:val="ListBullet"/>
-      </w:pPr>
-      <w:r>
-        <w:t>Check categorical encodings and numeric ranges before serving requests.</w:t>
-      </w:r>
-    </w:p>
-    <w:p>
-      <w:pPr>
-        <w:pStyle w:val="Heading2"/>
-      </w:pPr>
-      <w:r>
-        <w:t xml:space="preserve">2.4 </w:t>
-      </w:r>
-      <w:r>
-        <w:t>Limitations of the dataset</w:t>
-      </w:r>
-    </w:p>
-    <w:p>
-      <w:r>
-        <w:t>The dataset is small and comes from a particular clinical context. Its results should not be generalized to other populations or healthcare settings without external validation. The dataset and model are used here to demonstrate engineering practices rather than clinical efficacy.</w:t>
-      </w:r>
-    </w:p>
-    <w:p>
-      <w:r>
-        <w:br w:type="page"/>
-      </w:r>
-    </w:p>
-    <w:p>
-      <w:pPr>
-        <w:pStyle w:val="Heading1"/>
-      </w:pPr>
-      <w:r>
-        <w:lastRenderedPageBreak/>
-        <w:t>3. Exploratory Data Analysis</w:t>
-      </w:r>
-    </w:p>
-    <w:p>
-      <w:r>
-        <w:t>The project contains EDA figures under screenshots/eda/. These figures support inspection of the target distribution, age distribution, cholesterol by target, and feature correlations.</w:t>
+        <w:t>1.4 Missing data</w:t>
       </w:r>
     </w:p>
     <w:tbl>
@@ -808,8 +876,8 @@
         <w:tblLook w:val="04A0" w:firstRow="1" w:lastRow="0" w:firstColumn="1" w:lastColumn="0" w:noHBand="0" w:noVBand="1"/>
       </w:tblPr>
       <w:tblGrid>
-        <w:gridCol w:w="4968"/>
-        <w:gridCol w:w="4968"/>
+        <w:gridCol w:w="5040"/>
+        <w:gridCol w:w="5040"/>
       </w:tblGrid>
       <w:tr>
         <w:trPr>
@@ -818,24 +886,34 @@
         <w:tc>
           <w:tcPr>
             <w:cnfStyle w:val="001000000000" w:firstRow="0" w:lastRow="0" w:firstColumn="1" w:lastColumn="0" w:oddVBand="0" w:evenVBand="0" w:oddHBand="0" w:evenHBand="0" w:firstRowFirstColumn="0" w:firstRowLastColumn="0" w:lastRowFirstColumn="0" w:lastRowLastColumn="0"/>
-            <w:tcW w:w="4968" w:type="dxa"/>
+            <w:tcW w:w="5040" w:type="dxa"/>
           </w:tcPr>
           <w:p>
+            <w:pPr>
+              <w:spacing w:after="0"/>
+            </w:pPr>
             <w:r>
-              <w:t>Figure</w:t>
+              <w:rPr>
+                <w:sz w:val="16"/>
+              </w:rPr>
+              <w:t>Feature</w:t>
             </w:r>
           </w:p>
         </w:tc>
         <w:tc>
           <w:tcPr>
-            <w:tcW w:w="4968" w:type="dxa"/>
+            <w:tcW w:w="5040" w:type="dxa"/>
           </w:tcPr>
           <w:p>
             <w:pPr>
+              <w:spacing w:after="0"/>
               <w:cnfStyle w:val="100000000000" w:firstRow="1" w:lastRow="0" w:firstColumn="0" w:lastColumn="0" w:oddVBand="0" w:evenVBand="0" w:oddHBand="0" w:evenHBand="0" w:firstRowFirstColumn="0" w:firstRowLastColumn="0" w:lastRowFirstColumn="0" w:lastRowLastColumn="0"/>
             </w:pPr>
             <w:r>
-              <w:t>Purpose</w:t>
+              <w:rPr>
+                <w:sz w:val="16"/>
+              </w:rPr>
+              <w:t>Missing values recorded</w:t>
             </w:r>
           </w:p>
         </w:tc>
@@ -847,24 +925,40 @@
         <w:tc>
           <w:tcPr>
             <w:cnfStyle w:val="001000000000" w:firstRow="0" w:lastRow="0" w:firstColumn="1" w:lastColumn="0" w:oddVBand="0" w:evenVBand="0" w:oddHBand="0" w:evenHBand="0" w:firstRowFirstColumn="0" w:firstRowLastColumn="0" w:lastRowFirstColumn="0" w:lastRowLastColumn="0"/>
-            <w:tcW w:w="4968" w:type="dxa"/>
+            <w:tcW w:w="5040" w:type="dxa"/>
           </w:tcPr>
           <w:p>
+            <w:pPr>
+              <w:spacing w:after="0"/>
+            </w:pPr>
             <w:r>
-              <w:t>target_balance.png</w:t>
+              <w:rPr>
+                <w:sz w:val="16"/>
+              </w:rPr>
+              <w:t>C</w:t>
+            </w:r>
+            <w:r>
+              <w:rPr>
+                <w:sz w:val="16"/>
+              </w:rPr>
+              <w:t>a</w:t>
             </w:r>
           </w:p>
         </w:tc>
         <w:tc>
           <w:tcPr>
-            <w:tcW w:w="4968" w:type="dxa"/>
+            <w:tcW w:w="5040" w:type="dxa"/>
           </w:tcPr>
           <w:p>
             <w:pPr>
+              <w:spacing w:after="0"/>
               <w:cnfStyle w:val="000000100000" w:firstRow="0" w:lastRow="0" w:firstColumn="0" w:lastColumn="0" w:oddVBand="0" w:evenVBand="0" w:oddHBand="1" w:evenHBand="0" w:firstRowFirstColumn="0" w:firstRowLastColumn="0" w:lastRowFirstColumn="0" w:lastRowLastColumn="0"/>
             </w:pPr>
             <w:r>
-              <w:t>Shows the count of examples in each target class.</w:t>
+              <w:rPr>
+                <w:sz w:val="16"/>
+              </w:rPr>
+              <w:t>4</w:t>
             </w:r>
           </w:p>
         </w:tc>
@@ -873,24 +967,333 @@
         <w:tc>
           <w:tcPr>
             <w:cnfStyle w:val="001000000000" w:firstRow="0" w:lastRow="0" w:firstColumn="1" w:lastColumn="0" w:oddVBand="0" w:evenVBand="0" w:oddHBand="0" w:evenHBand="0" w:firstRowFirstColumn="0" w:firstRowLastColumn="0" w:lastRowFirstColumn="0" w:lastRowLastColumn="0"/>
-            <w:tcW w:w="4968" w:type="dxa"/>
+            <w:tcW w:w="5040" w:type="dxa"/>
           </w:tcPr>
           <w:p>
+            <w:pPr>
+              <w:spacing w:after="0"/>
+            </w:pPr>
             <w:r>
-              <w:t>age_distribution.png</w:t>
+              <w:rPr>
+                <w:sz w:val="16"/>
+              </w:rPr>
+              <w:t>T</w:t>
+            </w:r>
+            <w:r>
+              <w:rPr>
+                <w:sz w:val="16"/>
+              </w:rPr>
+              <w:t>hal</w:t>
             </w:r>
           </w:p>
         </w:tc>
         <w:tc>
           <w:tcPr>
-            <w:tcW w:w="4968" w:type="dxa"/>
+            <w:tcW w:w="5040" w:type="dxa"/>
           </w:tcPr>
           <w:p>
             <w:pPr>
+              <w:spacing w:after="0"/>
               <w:cnfStyle w:val="000000000000" w:firstRow="0" w:lastRow="0" w:firstColumn="0" w:lastColumn="0" w:oddVBand="0" w:evenVBand="0" w:oddHBand="0" w:evenHBand="0" w:firstRowFirstColumn="0" w:firstRowLastColumn="0" w:lastRowFirstColumn="0" w:lastRowLastColumn="0"/>
             </w:pPr>
             <w:r>
-              <w:t>Shows the distribution of age values.</w:t>
+              <w:rPr>
+                <w:sz w:val="16"/>
+              </w:rPr>
+              <w:t>2</w:t>
+            </w:r>
+          </w:p>
+        </w:tc>
+      </w:tr>
+    </w:tbl>
+    <w:p>
+      <w:r>
+        <w:t>Data inspection identified missing values in ca and thal. Missing or unknown values should be handled consistently during training and inference. The saved pipeline keeps preprocessing and prediction together.</w:t>
+      </w:r>
+    </w:p>
+    <w:p>
+      <w:pPr>
+        <w:pStyle w:val="Heading2"/>
+      </w:pPr>
+      <w:r>
+        <w:t>1.5 Data quality considerations</w:t>
+      </w:r>
+    </w:p>
+    <w:p>
+      <w:pPr>
+        <w:pStyle w:val="ListBullet"/>
+        <w:spacing w:after="20"/>
+      </w:pPr>
+      <w:r>
+        <w:t>Validate column names, data types, and expected feature count.</w:t>
+      </w:r>
+    </w:p>
+    <w:p>
+      <w:pPr>
+        <w:pStyle w:val="ListBullet"/>
+        <w:spacing w:after="20"/>
+      </w:pPr>
+      <w:r>
+        <w:t xml:space="preserve">Treat missing or </w:t>
+      </w:r>
+      <w:r>
+        <w:t>unknown markers consistently.</w:t>
+      </w:r>
+    </w:p>
+    <w:p>
+      <w:pPr>
+        <w:pStyle w:val="ListBullet"/>
+        <w:spacing w:after="20"/>
+      </w:pPr>
+      <w:r>
+        <w:t>Do not use target information as an input feature.</w:t>
+      </w:r>
+    </w:p>
+    <w:p>
+      <w:pPr>
+        <w:pStyle w:val="ListBullet"/>
+        <w:spacing w:after="20"/>
+      </w:pPr>
+      <w:r>
+        <w:t>Ensure API fields match the model's expected feature schema.</w:t>
+      </w:r>
+    </w:p>
+    <w:p>
+      <w:pPr>
+        <w:pStyle w:val="ListBullet"/>
+        <w:spacing w:after="20"/>
+      </w:pPr>
+      <w:r>
+        <w:t>Document data preparation to support reproducibility.</w:t>
+      </w:r>
+    </w:p>
+    <w:p>
+      <w:r>
+        <w:br w:type="page"/>
+      </w:r>
+    </w:p>
+    <w:p>
+      <w:pPr>
+        <w:pStyle w:val="Heading1"/>
+      </w:pPr>
+      <w:r>
+        <w:lastRenderedPageBreak/>
+        <w:t>2. Exploratory Data Analysis</w:t>
+      </w:r>
+    </w:p>
+    <w:p>
+      <w:r>
+        <w:t>EDA was performed before model comparison to understand the dataset and identify patterns worth examining. Generated visualizations are stored under screenshots/eda/.</w:t>
+      </w:r>
+    </w:p>
+    <w:p>
+      <w:pPr>
+        <w:pStyle w:val="Heading2"/>
+      </w:pPr>
+      <w:r>
+        <w:t>2.1 Age distribution</w:t>
+      </w:r>
+    </w:p>
+    <w:p>
+      <w:r>
+        <w:t>age_distribution.png summarizes the distribution of ages in the records. It helps reveal the represented age range and whether the dataset is concentrated in particular age bands. It describes this dataset and should not be generalized to a wider population.</w:t>
+      </w:r>
+    </w:p>
+    <w:p>
+      <w:pPr>
+        <w:pStyle w:val="Heading2"/>
+      </w:pPr>
+      <w:r>
+        <w:t>2.2 Cholesterol by target</w:t>
+      </w:r>
+    </w:p>
+    <w:p>
+      <w:r>
+        <w:t>cholesterol_by_target.png compares cholesterol values across target classes. It supports visual comparison of feature distributions. Overlap between classes is common; a plot alone cannot establish causation or prove predictive value.</w:t>
+      </w:r>
+    </w:p>
+    <w:p>
+      <w:pPr>
+        <w:pStyle w:val="Heading2"/>
+      </w:pPr>
+      <w:r>
+        <w:t>2.3 Correlation heatmap</w:t>
+      </w:r>
+    </w:p>
+    <w:p>
+      <w:r>
+        <w:t>correlation_heatmap.png visualizes pairwise correlations among numeric features. Correlation can identify related variables or potential redundancy, but it does not imply causation and may not capture nonlinear relationships.</w:t>
+      </w:r>
+    </w:p>
+    <w:p>
+      <w:pPr>
+        <w:pStyle w:val="Heading2"/>
+      </w:pPr>
+      <w:r>
+        <w:t>2.4 Target balance</w:t>
+      </w:r>
+    </w:p>
+    <w:p>
+      <w:r>
+        <w:t>target_balance.png visualizes target counts: 164 for class 0 and 139 for class 1. This informs evaluation: accuracy should be considered alongside precision, recall, and ROC-AUC.</w:t>
+      </w:r>
+    </w:p>
+    <w:p>
+      <w:pPr>
+        <w:pStyle w:val="Heading2"/>
+      </w:pPr>
+      <w:r>
+        <w:t>2.5 EDA outputs</w:t>
+      </w:r>
+    </w:p>
+    <w:p>
+      <w:pPr>
+        <w:pStyle w:val="ListBullet"/>
+        <w:spacing w:after="20"/>
+      </w:pPr>
+      <w:r>
+        <w:t>screenshots/eda/age_distribution.png</w:t>
+      </w:r>
+    </w:p>
+    <w:p>
+      <w:pPr>
+        <w:pStyle w:val="ListBullet"/>
+        <w:spacing w:after="20"/>
+      </w:pPr>
+      <w:r>
+        <w:t>screenshots/eda/cholesterol_by_target.png</w:t>
+      </w:r>
+    </w:p>
+    <w:p>
+      <w:pPr>
+        <w:pStyle w:val="ListBullet"/>
+        <w:spacing w:after="20"/>
+      </w:pPr>
+      <w:r>
+        <w:t>screenshots/eda/correlation_heatmap.png</w:t>
+      </w:r>
+    </w:p>
+    <w:p>
+      <w:pPr>
+        <w:pStyle w:val="ListBullet"/>
+        <w:spacing w:after="20"/>
+      </w:pPr>
+      <w:r>
+        <w:t>screenshots/eda/target_balance.png</w:t>
+      </w:r>
+    </w:p>
+    <w:p>
+      <w:r>
+        <w:t>EDA improves data familiarity but does not replace validation, leakage checks, or evaluation on unseen data.</w:t>
+      </w:r>
+    </w:p>
+    <w:p>
+      <w:r>
+        <w:br w:type="page"/>
+      </w:r>
+    </w:p>
+    <w:p>
+      <w:pPr>
+        <w:pStyle w:val="Heading1"/>
+      </w:pPr>
+      <w:r>
+        <w:lastRenderedPageBreak/>
+        <w:t>3. Methodology and Model Training</w:t>
+      </w:r>
+    </w:p>
+    <w:p>
+      <w:pPr>
+        <w:pStyle w:val="Heading2"/>
+      </w:pPr>
+      <w:r>
+        <w:t>3.1 Pipeline approach</w:t>
+      </w:r>
+    </w:p>
+    <w:p>
+      <w:r>
+        <w:t xml:space="preserve">Training logic is organized in src/train.py and fitted </w:t>
+      </w:r>
+      <w:r>
+        <w:t>artifacts are stored in models/. Keeping preprocessing and the estimator together in a pipeline reduces the risk of applying different transformations during training and inference.</w:t>
+      </w:r>
+    </w:p>
+    <w:p>
+      <w:pPr>
+        <w:pStyle w:val="Heading2"/>
+      </w:pPr>
+      <w:r>
+        <w:t>3.2 Candidate algorithms</w:t>
+      </w:r>
+    </w:p>
+    <w:tbl>
+      <w:tblPr>
+        <w:tblStyle w:val="LightShading-Accent1"/>
+        <w:tblW w:w="0" w:type="auto"/>
+        <w:tblLook w:val="04A0" w:firstRow="1" w:lastRow="0" w:firstColumn="1" w:lastColumn="0" w:noHBand="0" w:noVBand="1"/>
+      </w:tblPr>
+      <w:tblGrid>
+        <w:gridCol w:w="3360"/>
+        <w:gridCol w:w="3360"/>
+        <w:gridCol w:w="3360"/>
+      </w:tblGrid>
+      <w:tr>
+        <w:trPr>
+          <w:cnfStyle w:val="100000000000" w:firstRow="1" w:lastRow="0" w:firstColumn="0" w:lastColumn="0" w:oddVBand="0" w:evenVBand="0" w:oddHBand="0" w:evenHBand="0" w:firstRowFirstColumn="0" w:firstRowLastColumn="0" w:lastRowFirstColumn="0" w:lastRowLastColumn="0"/>
+        </w:trPr>
+        <w:tc>
+          <w:tcPr>
+            <w:cnfStyle w:val="001000000000" w:firstRow="0" w:lastRow="0" w:firstColumn="1" w:lastColumn="0" w:oddVBand="0" w:evenVBand="0" w:oddHBand="0" w:evenHBand="0" w:firstRowFirstColumn="0" w:firstRowLastColumn="0" w:lastRowFirstColumn="0" w:lastRowLastColumn="0"/>
+            <w:tcW w:w="3360" w:type="dxa"/>
+          </w:tcPr>
+          <w:p>
+            <w:pPr>
+              <w:spacing w:after="0"/>
+            </w:pPr>
+            <w:r>
+              <w:rPr>
+                <w:sz w:val="16"/>
+              </w:rPr>
+              <w:t>Algorithm</w:t>
+            </w:r>
+          </w:p>
+        </w:tc>
+        <w:tc>
+          <w:tcPr>
+            <w:tcW w:w="3360" w:type="dxa"/>
+          </w:tcPr>
+          <w:p>
+            <w:pPr>
+              <w:spacing w:after="0"/>
+              <w:cnfStyle w:val="100000000000" w:firstRow="1" w:lastRow="0" w:firstColumn="0" w:lastColumn="0" w:oddVBand="0" w:evenVBand="0" w:oddHBand="0" w:evenHBand="0" w:firstRowFirstColumn="0" w:firstRowLastColumn="0" w:lastRowFirstColumn="0" w:lastRowLastColumn="0"/>
+            </w:pPr>
+            <w:r>
+              <w:rPr>
+                <w:sz w:val="16"/>
+              </w:rPr>
+              <w:t>Description</w:t>
+            </w:r>
+          </w:p>
+        </w:tc>
+        <w:tc>
+          <w:tcPr>
+            <w:tcW w:w="3360" w:type="dxa"/>
+          </w:tcPr>
+          <w:p>
+            <w:pPr>
+              <w:spacing w:after="0"/>
+              <w:cnfStyle w:val="100000000000" w:firstRow="1" w:lastRow="0" w:firstColumn="0" w:lastColumn="0" w:oddVBand="0" w:evenVBand="0" w:oddHBand="0" w:evenHBand="0" w:firstRowFirstColumn="0" w:firstRowLastColumn="0" w:lastRowFirstColumn="0" w:lastRowLastColumn="0"/>
+            </w:pPr>
+            <w:r>
+              <w:rPr>
+                <w:sz w:val="16"/>
+              </w:rPr>
+              <w:t xml:space="preserve">Reason for </w:t>
+            </w:r>
+            <w:r>
+              <w:rPr>
+                <w:sz w:val="16"/>
+              </w:rPr>
+              <w:t>inclusion</w:t>
             </w:r>
           </w:p>
         </w:tc>
@@ -902,24 +1305,51 @@
         <w:tc>
           <w:tcPr>
             <w:cnfStyle w:val="001000000000" w:firstRow="0" w:lastRow="0" w:firstColumn="1" w:lastColumn="0" w:oddVBand="0" w:evenVBand="0" w:oddHBand="0" w:evenHBand="0" w:firstRowFirstColumn="0" w:firstRowLastColumn="0" w:lastRowFirstColumn="0" w:lastRowLastColumn="0"/>
-            <w:tcW w:w="4968" w:type="dxa"/>
+            <w:tcW w:w="3360" w:type="dxa"/>
           </w:tcPr>
           <w:p>
+            <w:pPr>
+              <w:spacing w:after="0"/>
+            </w:pPr>
             <w:r>
-              <w:t>cholesterol_by_target.png</w:t>
+              <w:rPr>
+                <w:sz w:val="16"/>
+              </w:rPr>
+              <w:t>Logistic Regression</w:t>
             </w:r>
           </w:p>
         </w:tc>
         <w:tc>
           <w:tcPr>
-            <w:tcW w:w="4968" w:type="dxa"/>
+            <w:tcW w:w="3360" w:type="dxa"/>
           </w:tcPr>
           <w:p>
             <w:pPr>
+              <w:spacing w:after="0"/>
               <w:cnfStyle w:val="000000100000" w:firstRow="0" w:lastRow="0" w:firstColumn="0" w:lastColumn="0" w:oddVBand="0" w:evenVBand="0" w:oddHBand="1" w:evenHBand="0" w:firstRowFirstColumn="0" w:firstRowLastColumn="0" w:lastRowFirstColumn="0" w:lastRowLastColumn="0"/>
             </w:pPr>
             <w:r>
-              <w:t>Compares cholesterol values across target groups.</w:t>
+              <w:rPr>
+                <w:sz w:val="16"/>
+              </w:rPr>
+              <w:t>Linear classifier that estimates class probabilities.</w:t>
+            </w:r>
+          </w:p>
+        </w:tc>
+        <w:tc>
+          <w:tcPr>
+            <w:tcW w:w="3360" w:type="dxa"/>
+          </w:tcPr>
+          <w:p>
+            <w:pPr>
+              <w:spacing w:after="0"/>
+              <w:cnfStyle w:val="000000100000" w:firstRow="0" w:lastRow="0" w:firstColumn="0" w:lastColumn="0" w:oddVBand="0" w:evenVBand="0" w:oddHBand="1" w:evenHBand="0" w:firstRowFirstColumn="0" w:firstRowLastColumn="0" w:lastRowFirstColumn="0" w:lastRowLastColumn="0"/>
+            </w:pPr>
+            <w:r>
+              <w:rPr>
+                <w:sz w:val="16"/>
+              </w:rPr>
+              <w:t>Baseline for binary classification.</w:t>
             </w:r>
           </w:p>
         </w:tc>
@@ -928,41 +1358,103 @@
         <w:tc>
           <w:tcPr>
             <w:cnfStyle w:val="001000000000" w:firstRow="0" w:lastRow="0" w:firstColumn="1" w:lastColumn="0" w:oddVBand="0" w:evenVBand="0" w:oddHBand="0" w:evenHBand="0" w:firstRowFirstColumn="0" w:firstRowLastColumn="0" w:lastRowFirstColumn="0" w:lastRowLastColumn="0"/>
-            <w:tcW w:w="4968" w:type="dxa"/>
+            <w:tcW w:w="3360" w:type="dxa"/>
           </w:tcPr>
           <w:p>
+            <w:pPr>
+              <w:spacing w:after="0"/>
+            </w:pPr>
             <w:r>
-              <w:t>correlation_heatmap.png</w:t>
+              <w:rPr>
+                <w:sz w:val="16"/>
+              </w:rPr>
+              <w:t>Random Forest</w:t>
             </w:r>
           </w:p>
         </w:tc>
         <w:tc>
           <w:tcPr>
-            <w:tcW w:w="4968" w:type="dxa"/>
+            <w:tcW w:w="3360" w:type="dxa"/>
           </w:tcPr>
           <w:p>
             <w:pPr>
+              <w:spacing w:after="0"/>
               <w:cnfStyle w:val="000000000000" w:firstRow="0" w:lastRow="0" w:firstColumn="0" w:lastColumn="0" w:oddVBand="0" w:evenVBand="0" w:oddHBand="0" w:evenHBand="0" w:firstRowFirstColumn="0" w:firstRowLastColumn="0" w:lastRowFirstColumn="0" w:lastRowLastColumn="0"/>
             </w:pPr>
             <w:r>
-              <w:t>Summarizes pairwise numeric feature correlations.</w:t>
+              <w:rPr>
+                <w:sz w:val="16"/>
+              </w:rPr>
+              <w:t>Ensemble of decision trees using randomized samples/features.</w:t>
+            </w:r>
+          </w:p>
+        </w:tc>
+        <w:tc>
+          <w:tcPr>
+            <w:tcW w:w="3360" w:type="dxa"/>
+          </w:tcPr>
+          <w:p>
+            <w:pPr>
+              <w:spacing w:after="0"/>
+              <w:cnfStyle w:val="000000000000" w:firstRow="0" w:lastRow="0" w:firstColumn="0" w:lastColumn="0" w:oddVBand="0" w:evenVBand="0" w:oddHBand="0" w:evenHBand="0" w:firstRowFirstColumn="0" w:firstRowLastColumn="0" w:lastRowFirstColumn="0" w:lastRowLastColumn="0"/>
+            </w:pPr>
+            <w:r>
+              <w:rPr>
+                <w:sz w:val="16"/>
+              </w:rPr>
+              <w:t>Can model nonlinear patterns and interactions.</w:t>
             </w:r>
           </w:p>
         </w:tc>
       </w:tr>
     </w:tbl>
-    <w:p/>
     <w:p>
       <w:pPr>
         <w:pStyle w:val="Heading2"/>
       </w:pPr>
       <w:r>
-        <w:t>3.1 Interpretation approach</w:t>
-      </w:r>
-    </w:p>
-    <w:p>
-      <w:r>
-        <w:t>EDA is used to understand the data before training, identify potential data-quality concerns, and provide context for evaluation. Distribution plots reveal skew and range; group comparisons can reveal differences that warrant further analysis; correlation plots help identify related numeric features. None of these plots alone demonstrates causation or establishes a clinically meaningful relationship.</w:t>
+        <w:t>3.3 Evaluation metrics</w:t>
+      </w:r>
+    </w:p>
+    <w:p>
+      <w:pPr>
+        <w:pStyle w:val="ListBullet"/>
+        <w:spacing w:after="20"/>
+      </w:pPr>
+      <w:r>
+        <w:t>Accuracy: fraction of predictions matching true labels.</w:t>
+      </w:r>
+    </w:p>
+    <w:p>
+      <w:pPr>
+        <w:pStyle w:val="ListBullet"/>
+        <w:spacing w:after="20"/>
+      </w:pPr>
+      <w:r>
+        <w:t>Precision: fraction of positive predictions that are truly positive.</w:t>
+      </w:r>
+    </w:p>
+    <w:p>
+      <w:pPr>
+        <w:pStyle w:val="ListBullet"/>
+        <w:spacing w:after="20"/>
+      </w:pPr>
+      <w:r>
+        <w:t>Recall: fraction of actual positive cases identified.</w:t>
+      </w:r>
+    </w:p>
+    <w:p>
+      <w:pPr>
+        <w:pStyle w:val="ListBullet"/>
+        <w:spacing w:after="20"/>
+      </w:pPr>
+      <w:r>
+        <w:t>ROC-AUC: ranking ability across classification thresholds.</w:t>
+      </w:r>
+    </w:p>
+    <w:p>
+      <w:r>
+        <w:t>False negatives and false positives may have different implications in medical-themed classification. Metrics must therefore be interpreted together. These results do not establish clinical readiness.</w:t>
       </w:r>
     </w:p>
     <w:p>
@@ -970,12 +1462,12 @@
         <w:pStyle w:val="Heading2"/>
       </w:pPr>
       <w:r>
-        <w:t>3.2 Reproducibility</w:t>
-      </w:r>
-    </w:p>
-    <w:p>
-      <w:r>
-        <w:t>The repository includes the EDA script and saved figures. To reproduce the figures, install the dependencies listed in requirements.txt, activate the project environment, and run the EDA script from the repository root. If the script expects a particular file path, retain the repository's data directory layout.</w:t>
+        <w:t>3.4 Reproducibility</w:t>
+      </w:r>
+    </w:p>
+    <w:p>
+      <w:r>
+        <w:t>Recorded training metadata includes random_state=42 and five cross-validation folds. Fixed seeds and documented settings improve repeatability, although results may still depend on library versions, data preparation, and runtime environment.</w:t>
       </w:r>
     </w:p>
     <w:p>
@@ -983,31 +1475,12 @@
         <w:pStyle w:val="Heading2"/>
       </w:pPr>
       <w:r>
-        <w:t>3.3 Evidence to include in final submission</w:t>
-      </w:r>
-    </w:p>
-    <w:p>
-      <w:pPr>
-        <w:pStyle w:val="ListBullet"/>
-      </w:pPr>
-      <w:r>
-        <w:t>A screenshot of the EDA script completing successfully.</w:t>
-      </w:r>
-    </w:p>
-    <w:p>
-      <w:pPr>
-        <w:pStyle w:val="ListBullet"/>
-      </w:pPr>
-      <w:r>
-        <w:t>The four generated figures or a screenshot showing them.</w:t>
-      </w:r>
-    </w:p>
-    <w:p>
-      <w:pPr>
-        <w:pStyle w:val="ListBullet"/>
-      </w:pPr>
-      <w:r>
-        <w:t>A brief explanation of the observed class balance and missing values.</w:t>
+        <w:t>3.5 Artifact storage</w:t>
+      </w:r>
+    </w:p>
+    <w:p>
+      <w:r>
+        <w:t>The selected pipeline is stored at models/heart_disease_pipeline.joblib. Separate artifacts exist for Logistic Regression and Random Forest. The comparison output is reports/model_comparison.json.</w:t>
       </w:r>
     </w:p>
     <w:p>
@@ -1021,79 +1494,15 @@
       </w:pPr>
       <w:r>
         <w:lastRenderedPageBreak/>
-        <w:t>4. Preprocessing and Model Training</w:t>
-      </w:r>
-    </w:p>
-    <w:p>
-      <w:r>
-        <w:t xml:space="preserve">The project trains two baseline classifiers: Logistic Regression and Random Forest. The selected serialized artifact is </w:t>
-      </w:r>
-      <w:r>
-        <w:t>models/heart_disease_pipeline.joblib. The pipeline approach is important because the transformations used during training must also be applied during inference.</w:t>
-      </w:r>
-    </w:p>
-    <w:p>
-      <w:pPr>
-        <w:pStyle w:val="Heading2"/>
-      </w:pPr>
-      <w:r>
-        <w:t>4.1 Training workflow</w:t>
-      </w:r>
-    </w:p>
-    <w:p>
-      <w:pPr>
-        <w:pStyle w:val="ListBullet"/>
-      </w:pPr>
-      <w:r>
-        <w:t>Load the dataset and interpret the target as a binary classification label.</w:t>
-      </w:r>
-    </w:p>
-    <w:p>
-      <w:pPr>
-        <w:pStyle w:val="ListBullet"/>
-      </w:pPr>
-      <w:r>
-        <w:t>Separate features from the target and split the data into training and evaluation partitions.</w:t>
-      </w:r>
-    </w:p>
-    <w:p>
-      <w:pPr>
-        <w:pStyle w:val="ListBullet"/>
-      </w:pPr>
-      <w:r>
-        <w:t>Fit preprocessing on the training data and train each candidate classifier.</w:t>
-      </w:r>
-    </w:p>
-    <w:p>
-      <w:pPr>
-        <w:pStyle w:val="ListBullet"/>
-      </w:pPr>
-      <w:r>
-        <w:t>Evaluate both candidates on the held-out evaluation data.</w:t>
-      </w:r>
-    </w:p>
-    <w:p>
-      <w:pPr>
-        <w:pStyle w:val="ListBullet"/>
-      </w:pPr>
-      <w:r>
-        <w:t>Record model metrics and save the selected pipeline artifact.</w:t>
-      </w:r>
-    </w:p>
-    <w:p>
-      <w:pPr>
-        <w:pStyle w:val="ListBullet"/>
-      </w:pPr>
-      <w:r>
-        <w:t>Save a machine-readable comparison in reports/model_comparison.json.</w:t>
-      </w:r>
-    </w:p>
-    <w:p>
-      <w:pPr>
-        <w:pStyle w:val="Heading2"/>
-      </w:pPr>
-      <w:r>
-        <w:t>4.2 Evaluation metrics</w:t>
+        <w:t>4. Results and Model Selection</w:t>
+      </w:r>
+    </w:p>
+    <w:p>
+      <w:r>
+        <w:t xml:space="preserve">The recorded model comparison is summarized below. </w:t>
+      </w:r>
+      <w:r>
+        <w:t>Values are rounded for readability.</w:t>
       </w:r>
     </w:p>
     <w:tbl>
@@ -1103,8 +1512,9 @@
         <w:tblLook w:val="04A0" w:firstRow="1" w:lastRow="0" w:firstColumn="1" w:lastColumn="0" w:noHBand="0" w:noVBand="1"/>
       </w:tblPr>
       <w:tblGrid>
-        <w:gridCol w:w="4968"/>
-        <w:gridCol w:w="4968"/>
+        <w:gridCol w:w="3360"/>
+        <w:gridCol w:w="3360"/>
+        <w:gridCol w:w="3360"/>
       </w:tblGrid>
       <w:tr>
         <w:trPr>
@@ -1113,236 +1523,50 @@
         <w:tc>
           <w:tcPr>
             <w:cnfStyle w:val="001000000000" w:firstRow="0" w:lastRow="0" w:firstColumn="1" w:lastColumn="0" w:oddVBand="0" w:evenVBand="0" w:oddHBand="0" w:evenHBand="0" w:firstRowFirstColumn="0" w:firstRowLastColumn="0" w:lastRowFirstColumn="0" w:lastRowLastColumn="0"/>
-            <w:tcW w:w="4968" w:type="dxa"/>
+            <w:tcW w:w="3360" w:type="dxa"/>
           </w:tcPr>
           <w:p>
+            <w:pPr>
+              <w:spacing w:after="0"/>
+            </w:pPr>
             <w:r>
+              <w:rPr>
+                <w:sz w:val="16"/>
+              </w:rPr>
               <w:t>Metric</w:t>
             </w:r>
           </w:p>
         </w:tc>
         <w:tc>
           <w:tcPr>
-            <w:tcW w:w="4968" w:type="dxa"/>
+            <w:tcW w:w="3360" w:type="dxa"/>
           </w:tcPr>
           <w:p>
             <w:pPr>
+              <w:spacing w:after="0"/>
               <w:cnfStyle w:val="100000000000" w:firstRow="1" w:lastRow="0" w:firstColumn="0" w:lastColumn="0" w:oddVBand="0" w:evenVBand="0" w:oddHBand="0" w:evenHBand="0" w:firstRowFirstColumn="0" w:firstRowLastColumn="0" w:lastRowFirstColumn="0" w:lastRowLastColumn="0"/>
             </w:pPr>
             <w:r>
-              <w:t>Meaning</w:t>
-            </w:r>
-          </w:p>
-        </w:tc>
-      </w:tr>
-      <w:tr>
-        <w:trPr>
-          <w:cnfStyle w:val="000000100000" w:firstRow="0" w:lastRow="0" w:firstColumn="0" w:lastColumn="0" w:oddVBand="0" w:evenVBand="0" w:oddHBand="1" w:evenHBand="0" w:firstRowFirstColumn="0" w:firstRowLastColumn="0" w:lastRowFirstColumn="0" w:lastRowLastColumn="0"/>
-        </w:trPr>
-        <w:tc>
-          <w:tcPr>
-            <w:cnfStyle w:val="001000000000" w:firstRow="0" w:lastRow="0" w:firstColumn="1" w:lastColumn="0" w:oddVBand="0" w:evenVBand="0" w:oddHBand="0" w:evenHBand="0" w:firstRowFirstColumn="0" w:firstRowLastColumn="0" w:lastRowFirstColumn="0" w:lastRowLastColumn="0"/>
-            <w:tcW w:w="4968" w:type="dxa"/>
-          </w:tcPr>
-          <w:p>
-            <w:r>
-              <w:t>Accuracy</w:t>
-            </w:r>
-          </w:p>
-        </w:tc>
-        <w:tc>
-          <w:tcPr>
-            <w:tcW w:w="4968" w:type="dxa"/>
-          </w:tcPr>
-          <w:p>
-            <w:pPr>
-              <w:cnfStyle w:val="000000100000" w:firstRow="0" w:lastRow="0" w:firstColumn="0" w:lastColumn="0" w:oddVBand="0" w:evenVBand="0" w:oddHBand="1" w:evenHBand="0" w:firstRowFirstColumn="0" w:firstRowLastColumn="0" w:lastRowFirstColumn="0" w:lastRowLastColumn="0"/>
-            </w:pPr>
-            <w:r>
-              <w:t>Fraction of all evaluated examples classified correctly.</w:t>
-            </w:r>
-          </w:p>
-        </w:tc>
-      </w:tr>
-      <w:tr>
-        <w:tc>
-          <w:tcPr>
-            <w:cnfStyle w:val="001000000000" w:firstRow="0" w:lastRow="0" w:firstColumn="1" w:lastColumn="0" w:oddVBand="0" w:evenVBand="0" w:oddHBand="0" w:evenHBand="0" w:firstRowFirstColumn="0" w:firstRowLastColumn="0" w:lastRowFirstColumn="0" w:lastRowLastColumn="0"/>
-            <w:tcW w:w="4968" w:type="dxa"/>
-          </w:tcPr>
-          <w:p>
-            <w:r>
-              <w:t>Precision</w:t>
-            </w:r>
-          </w:p>
-        </w:tc>
-        <w:tc>
-          <w:tcPr>
-            <w:tcW w:w="4968" w:type="dxa"/>
-          </w:tcPr>
-          <w:p>
-            <w:pPr>
-              <w:cnfStyle w:val="000000000000" w:firstRow="0" w:lastRow="0" w:firstColumn="0" w:lastColumn="0" w:oddVBand="0" w:evenVBand="0" w:oddHBand="0" w:evenHBand="0" w:firstRowFirstColumn="0" w:firstRowLastColumn="0" w:lastRowFirstColumn="0" w:lastRowLastColumn="0"/>
-            </w:pPr>
-            <w:r>
-              <w:t>Fraction of predicted positives that are true positives.</w:t>
-            </w:r>
-          </w:p>
-        </w:tc>
-      </w:tr>
-      <w:tr>
-        <w:trPr>
-          <w:cnfStyle w:val="000000100000" w:firstRow="0" w:lastRow="0" w:firstColumn="0" w:lastColumn="0" w:oddVBand="0" w:evenVBand="0" w:oddHBand="1" w:evenHBand="0" w:firstRowFirstColumn="0" w:firstRowLastColumn="0" w:lastRowFirstColumn="0" w:lastRowLastColumn="0"/>
-        </w:trPr>
-        <w:tc>
-          <w:tcPr>
-            <w:cnfStyle w:val="001000000000" w:firstRow="0" w:lastRow="0" w:firstColumn="1" w:lastColumn="0" w:oddVBand="0" w:evenVBand="0" w:oddHBand="0" w:evenHBand="0" w:firstRowFirstColumn="0" w:firstRowLastColumn="0" w:lastRowFirstColumn="0" w:lastRowLastColumn="0"/>
-            <w:tcW w:w="4968" w:type="dxa"/>
-          </w:tcPr>
-          <w:p>
-            <w:r>
-              <w:t>Recall</w:t>
-            </w:r>
-          </w:p>
-        </w:tc>
-        <w:tc>
-          <w:tcPr>
-            <w:tcW w:w="4968" w:type="dxa"/>
-          </w:tcPr>
-          <w:p>
-            <w:pPr>
-              <w:cnfStyle w:val="000000100000" w:firstRow="0" w:lastRow="0" w:firstColumn="0" w:lastColumn="0" w:oddVBand="0" w:evenVBand="0" w:oddHBand="1" w:evenHBand="0" w:firstRowFirstColumn="0" w:firstRowLastColumn="0" w:lastRowFirstColumn="0" w:lastRowLastColumn="0"/>
-            </w:pPr>
-            <w:r>
-              <w:t>Fraction of actual positives that are identified.</w:t>
-            </w:r>
-          </w:p>
-        </w:tc>
-      </w:tr>
-      <w:tr>
-        <w:tc>
-          <w:tcPr>
-            <w:cnfStyle w:val="001000000000" w:firstRow="0" w:lastRow="0" w:firstColumn="1" w:lastColumn="0" w:oddVBand="0" w:evenVBand="0" w:oddHBand="0" w:evenHBand="0" w:firstRowFirstColumn="0" w:firstRowLastColumn="0" w:lastRowFirstColumn="0" w:lastRowLastColumn="0"/>
-            <w:tcW w:w="4968" w:type="dxa"/>
-          </w:tcPr>
-          <w:p>
-            <w:r>
-              <w:t>ROC-AUC</w:t>
-            </w:r>
-          </w:p>
-        </w:tc>
-        <w:tc>
-          <w:tcPr>
-            <w:tcW w:w="4968" w:type="dxa"/>
-          </w:tcPr>
-          <w:p>
-            <w:pPr>
-              <w:cnfStyle w:val="000000000000" w:firstRow="0" w:lastRow="0" w:firstColumn="0" w:lastColumn="0" w:oddVBand="0" w:evenVBand="0" w:oddHBand="0" w:evenHBand="0" w:firstRowFirstColumn="0" w:firstRowLastColumn="0" w:lastRowFirstColumn="0" w:lastRowLastColumn="0"/>
-            </w:pPr>
-            <w:r>
-              <w:t>Measures ranking/discrimination across classification thresholds.</w:t>
-            </w:r>
-          </w:p>
-        </w:tc>
-      </w:tr>
-    </w:tbl>
-    <w:p/>
-    <w:p>
-      <w:pPr>
-        <w:pStyle w:val="Heading2"/>
-      </w:pPr>
-      <w:r>
-        <w:t>4.3 Why multiple metrics matter</w:t>
-      </w:r>
-    </w:p>
-    <w:p>
-      <w:r>
-        <w:t xml:space="preserve">A model with high accuracy can still miss positive </w:t>
-      </w:r>
-      <w:r>
-        <w:t>examples or generate false positives. Precision and recall describe different error trade-offs, while ROC-AUC measures ranking performance across thresholds. In a real medical application, threshold choice and error costs would require domain experts, representative validation data, calibration analysis, and formal governance.</w:t>
-      </w:r>
-    </w:p>
-    <w:p>
-      <w:pPr>
-        <w:pStyle w:val="Heading2"/>
-      </w:pPr>
-      <w:r>
-        <w:t>4.4 Reproducibility considerations</w:t>
-      </w:r>
-    </w:p>
-    <w:p>
-      <w:r>
-        <w:t>Record random seeds, package versions, the data version, and the exact evaluation split in the code or report. Re-running training should regenerate the comparison file and serialized pipeline. If a training run changes the metrics, update this report and the demo evidence to match the final run.</w:t>
-      </w:r>
-    </w:p>
-    <w:p>
-      <w:r>
-        <w:br w:type="page"/>
-      </w:r>
-    </w:p>
-    <w:p>
-      <w:pPr>
-        <w:pStyle w:val="Heading1"/>
-      </w:pPr>
-      <w:r>
-        <w:lastRenderedPageBreak/>
-        <w:t>5. Results and Model Selection</w:t>
-      </w:r>
-    </w:p>
-    <w:p>
-      <w:r>
-        <w:t>The metrics below are the values recorded during project development. They should be regenerated from the final repository before submission if the training code or dependency versions have changed.</w:t>
-      </w:r>
-    </w:p>
-    <w:tbl>
-      <w:tblPr>
-        <w:tblStyle w:val="LightShading-Accent1"/>
-        <w:tblW w:w="0" w:type="auto"/>
-        <w:tblLook w:val="04A0" w:firstRow="1" w:lastRow="0" w:firstColumn="1" w:lastColumn="0" w:noHBand="0" w:noVBand="1"/>
-      </w:tblPr>
-      <w:tblGrid>
-        <w:gridCol w:w="3312"/>
-        <w:gridCol w:w="3312"/>
-        <w:gridCol w:w="3312"/>
-      </w:tblGrid>
-      <w:tr>
-        <w:trPr>
-          <w:cnfStyle w:val="100000000000" w:firstRow="1" w:lastRow="0" w:firstColumn="0" w:lastColumn="0" w:oddVBand="0" w:evenVBand="0" w:oddHBand="0" w:evenHBand="0" w:firstRowFirstColumn="0" w:firstRowLastColumn="0" w:lastRowFirstColumn="0" w:lastRowLastColumn="0"/>
-        </w:trPr>
-        <w:tc>
-          <w:tcPr>
-            <w:cnfStyle w:val="001000000000" w:firstRow="0" w:lastRow="0" w:firstColumn="1" w:lastColumn="0" w:oddVBand="0" w:evenVBand="0" w:oddHBand="0" w:evenHBand="0" w:firstRowFirstColumn="0" w:firstRowLastColumn="0" w:lastRowFirstColumn="0" w:lastRowLastColumn="0"/>
-            <w:tcW w:w="3312" w:type="dxa"/>
-          </w:tcPr>
-          <w:p>
-            <w:r>
-              <w:t>Metric</w:t>
-            </w:r>
-          </w:p>
-        </w:tc>
-        <w:tc>
-          <w:tcPr>
-            <w:tcW w:w="3312" w:type="dxa"/>
-          </w:tcPr>
-          <w:p>
-            <w:pPr>
-              <w:cnfStyle w:val="100000000000" w:firstRow="1" w:lastRow="0" w:firstColumn="0" w:lastColumn="0" w:oddVBand="0" w:evenVBand="0" w:oddHBand="0" w:evenHBand="0" w:firstRowFirstColumn="0" w:firstRowLastColumn="0" w:lastRowFirstColumn="0" w:lastRowLastColumn="0"/>
-            </w:pPr>
-            <w:r>
+              <w:rPr>
+                <w:sz w:val="16"/>
+              </w:rPr>
               <w:t>Logistic Regression</w:t>
             </w:r>
           </w:p>
         </w:tc>
         <w:tc>
           <w:tcPr>
-            <w:tcW w:w="3312" w:type="dxa"/>
+            <w:tcW w:w="3360" w:type="dxa"/>
           </w:tcPr>
           <w:p>
             <w:pPr>
+              <w:spacing w:after="0"/>
               <w:cnfStyle w:val="100000000000" w:firstRow="1" w:lastRow="0" w:firstColumn="0" w:lastColumn="0" w:oddVBand="0" w:evenVBand="0" w:oddHBand="0" w:evenHBand="0" w:firstRowFirstColumn="0" w:firstRowLastColumn="0" w:lastRowFirstColumn="0" w:lastRowLastColumn="0"/>
             </w:pPr>
             <w:r>
+              <w:rPr>
+                <w:sz w:val="16"/>
+              </w:rPr>
               <w:t>Random Forest</w:t>
             </w:r>
           </w:p>
@@ -1355,37 +1579,51 @@
         <w:tc>
           <w:tcPr>
             <w:cnfStyle w:val="001000000000" w:firstRow="0" w:lastRow="0" w:firstColumn="1" w:lastColumn="0" w:oddVBand="0" w:evenVBand="0" w:oddHBand="0" w:evenHBand="0" w:firstRowFirstColumn="0" w:firstRowLastColumn="0" w:lastRowFirstColumn="0" w:lastRowLastColumn="0"/>
-            <w:tcW w:w="3312" w:type="dxa"/>
+            <w:tcW w:w="3360" w:type="dxa"/>
           </w:tcPr>
           <w:p>
+            <w:pPr>
+              <w:spacing w:after="0"/>
+            </w:pPr>
             <w:r>
+              <w:rPr>
+                <w:sz w:val="16"/>
+              </w:rPr>
               <w:t>Accuracy</w:t>
             </w:r>
           </w:p>
         </w:tc>
         <w:tc>
           <w:tcPr>
-            <w:tcW w:w="3312" w:type="dxa"/>
+            <w:tcW w:w="3360" w:type="dxa"/>
           </w:tcPr>
           <w:p>
             <w:pPr>
+              <w:spacing w:after="0"/>
               <w:cnfStyle w:val="000000100000" w:firstRow="0" w:lastRow="0" w:firstColumn="0" w:lastColumn="0" w:oddVBand="0" w:evenVBand="0" w:oddHBand="1" w:evenHBand="0" w:firstRowFirstColumn="0" w:firstRowLastColumn="0" w:lastRowFirstColumn="0" w:lastRowLastColumn="0"/>
             </w:pPr>
             <w:r>
-              <w:t>0.8349</w:t>
+              <w:rPr>
+                <w:sz w:val="16"/>
+              </w:rPr>
+              <w:t>0.8349 (83.49%)</w:t>
             </w:r>
           </w:p>
         </w:tc>
         <w:tc>
           <w:tcPr>
-            <w:tcW w:w="3312" w:type="dxa"/>
+            <w:tcW w:w="3360" w:type="dxa"/>
           </w:tcPr>
           <w:p>
             <w:pPr>
+              <w:spacing w:after="0"/>
               <w:cnfStyle w:val="000000100000" w:firstRow="0" w:lastRow="0" w:firstColumn="0" w:lastColumn="0" w:oddVBand="0" w:evenVBand="0" w:oddHBand="1" w:evenHBand="0" w:firstRowFirstColumn="0" w:firstRowLastColumn="0" w:lastRowFirstColumn="0" w:lastRowLastColumn="0"/>
             </w:pPr>
             <w:r>
-              <w:t>0.8349</w:t>
+              <w:rPr>
+                <w:sz w:val="16"/>
+              </w:rPr>
+              <w:t>0.8349 (83.49%)</w:t>
             </w:r>
           </w:p>
         </w:tc>
@@ -1394,37 +1632,51 @@
         <w:tc>
           <w:tcPr>
             <w:cnfStyle w:val="001000000000" w:firstRow="0" w:lastRow="0" w:firstColumn="1" w:lastColumn="0" w:oddVBand="0" w:evenVBand="0" w:oddHBand="0" w:evenHBand="0" w:firstRowFirstColumn="0" w:firstRowLastColumn="0" w:lastRowFirstColumn="0" w:lastRowLastColumn="0"/>
-            <w:tcW w:w="3312" w:type="dxa"/>
+            <w:tcW w:w="3360" w:type="dxa"/>
           </w:tcPr>
           <w:p>
+            <w:pPr>
+              <w:spacing w:after="0"/>
+            </w:pPr>
             <w:r>
+              <w:rPr>
+                <w:sz w:val="16"/>
+              </w:rPr>
               <w:t>Precision</w:t>
             </w:r>
           </w:p>
         </w:tc>
         <w:tc>
           <w:tcPr>
-            <w:tcW w:w="3312" w:type="dxa"/>
+            <w:tcW w:w="3360" w:type="dxa"/>
           </w:tcPr>
           <w:p>
             <w:pPr>
+              <w:spacing w:after="0"/>
               <w:cnfStyle w:val="000000000000" w:firstRow="0" w:lastRow="0" w:firstColumn="0" w:lastColumn="0" w:oddVBand="0" w:evenVBand="0" w:oddHBand="0" w:evenHBand="0" w:firstRowFirstColumn="0" w:firstRowLastColumn="0" w:lastRowFirstColumn="0" w:lastRowLastColumn="0"/>
             </w:pPr>
             <w:r>
-              <w:t>0.8319</w:t>
+              <w:rPr>
+                <w:sz w:val="16"/>
+              </w:rPr>
+              <w:t>0.8319 (83.19%)</w:t>
             </w:r>
           </w:p>
         </w:tc>
         <w:tc>
           <w:tcPr>
-            <w:tcW w:w="3312" w:type="dxa"/>
+            <w:tcW w:w="3360" w:type="dxa"/>
           </w:tcPr>
           <w:p>
             <w:pPr>
+              <w:spacing w:after="0"/>
               <w:cnfStyle w:val="000000000000" w:firstRow="0" w:lastRow="0" w:firstColumn="0" w:lastColumn="0" w:oddVBand="0" w:evenVBand="0" w:oddHBand="0" w:evenHBand="0" w:firstRowFirstColumn="0" w:firstRowLastColumn="0" w:lastRowFirstColumn="0" w:lastRowLastColumn="0"/>
             </w:pPr>
             <w:r>
-              <w:t>0.8415</w:t>
+              <w:rPr>
+                <w:sz w:val="16"/>
+              </w:rPr>
+              <w:t>0.8415 (84.15%)</w:t>
             </w:r>
           </w:p>
         </w:tc>
@@ -1436,37 +1688,51 @@
         <w:tc>
           <w:tcPr>
             <w:cnfStyle w:val="001000000000" w:firstRow="0" w:lastRow="0" w:firstColumn="1" w:lastColumn="0" w:oddVBand="0" w:evenVBand="0" w:oddHBand="0" w:evenHBand="0" w:firstRowFirstColumn="0" w:firstRowLastColumn="0" w:lastRowFirstColumn="0" w:lastRowLastColumn="0"/>
-            <w:tcW w:w="3312" w:type="dxa"/>
+            <w:tcW w:w="3360" w:type="dxa"/>
           </w:tcPr>
           <w:p>
+            <w:pPr>
+              <w:spacing w:after="0"/>
+            </w:pPr>
             <w:r>
+              <w:rPr>
+                <w:sz w:val="16"/>
+              </w:rPr>
               <w:t>Recall</w:t>
             </w:r>
           </w:p>
         </w:tc>
         <w:tc>
           <w:tcPr>
-            <w:tcW w:w="3312" w:type="dxa"/>
+            <w:tcW w:w="3360" w:type="dxa"/>
           </w:tcPr>
           <w:p>
             <w:pPr>
+              <w:spacing w:after="0"/>
               <w:cnfStyle w:val="000000100000" w:firstRow="0" w:lastRow="0" w:firstColumn="0" w:lastColumn="0" w:oddVBand="0" w:evenVBand="0" w:oddHBand="1" w:evenHBand="0" w:firstRowFirstColumn="0" w:firstRowLastColumn="0" w:lastRowFirstColumn="0" w:lastRowLastColumn="0"/>
             </w:pPr>
             <w:r>
-              <w:t>0.8056</w:t>
+              <w:rPr>
+                <w:sz w:val="16"/>
+              </w:rPr>
+              <w:t>0.8056 (80.56%)</w:t>
             </w:r>
           </w:p>
         </w:tc>
         <w:tc>
           <w:tcPr>
-            <w:tcW w:w="3312" w:type="dxa"/>
+            <w:tcW w:w="3360" w:type="dxa"/>
           </w:tcPr>
           <w:p>
             <w:pPr>
+              <w:spacing w:after="0"/>
               <w:cnfStyle w:val="000000100000" w:firstRow="0" w:lastRow="0" w:firstColumn="0" w:lastColumn="0" w:oddVBand="0" w:evenVBand="0" w:oddHBand="1" w:evenHBand="0" w:firstRowFirstColumn="0" w:firstRowLastColumn="0" w:lastRowFirstColumn="0" w:lastRowLastColumn="0"/>
             </w:pPr>
             <w:r>
-              <w:t>0.7910</w:t>
+              <w:rPr>
+                <w:sz w:val="16"/>
+              </w:rPr>
+              <w:t>0.7910 (79.10%)</w:t>
             </w:r>
           </w:p>
         </w:tc>
@@ -1475,54 +1741,67 @@
         <w:tc>
           <w:tcPr>
             <w:cnfStyle w:val="001000000000" w:firstRow="0" w:lastRow="0" w:firstColumn="1" w:lastColumn="0" w:oddVBand="0" w:evenVBand="0" w:oddHBand="0" w:evenHBand="0" w:firstRowFirstColumn="0" w:firstRowLastColumn="0" w:lastRowFirstColumn="0" w:lastRowLastColumn="0"/>
-            <w:tcW w:w="3312" w:type="dxa"/>
+            <w:tcW w:w="3360" w:type="dxa"/>
           </w:tcPr>
           <w:p>
+            <w:pPr>
+              <w:spacing w:after="0"/>
+            </w:pPr>
             <w:r>
+              <w:rPr>
+                <w:sz w:val="16"/>
+              </w:rPr>
               <w:t>ROC-AUC</w:t>
             </w:r>
           </w:p>
         </w:tc>
         <w:tc>
           <w:tcPr>
-            <w:tcW w:w="3312" w:type="dxa"/>
+            <w:tcW w:w="3360" w:type="dxa"/>
           </w:tcPr>
           <w:p>
             <w:pPr>
+              <w:spacing w:after="0"/>
               <w:cnfStyle w:val="000000000000" w:firstRow="0" w:lastRow="0" w:firstColumn="0" w:lastColumn="0" w:oddVBand="0" w:evenVBand="0" w:oddHBand="0" w:evenHBand="0" w:firstRowFirstColumn="0" w:firstRowLastColumn="0" w:lastRowFirstColumn="0" w:lastRowLastColumn="0"/>
             </w:pPr>
             <w:r>
-              <w:t>0.9099</w:t>
+              <w:rPr>
+                <w:sz w:val="16"/>
+              </w:rPr>
+              <w:t>0.9099 (90.99%)</w:t>
             </w:r>
           </w:p>
         </w:tc>
         <w:tc>
           <w:tcPr>
-            <w:tcW w:w="3312" w:type="dxa"/>
+            <w:tcW w:w="3360" w:type="dxa"/>
           </w:tcPr>
           <w:p>
             <w:pPr>
+              <w:spacing w:after="0"/>
               <w:cnfStyle w:val="000000000000" w:firstRow="0" w:lastRow="0" w:firstColumn="0" w:lastColumn="0" w:oddVBand="0" w:evenVBand="0" w:oddHBand="0" w:evenHBand="0" w:firstRowFirstColumn="0" w:firstRowLastColumn="0" w:lastRowFirstColumn="0" w:lastRowLastColumn="0"/>
             </w:pPr>
             <w:r>
-              <w:t>0.9125</w:t>
+              <w:rPr>
+                <w:sz w:val="16"/>
+              </w:rPr>
+              <w:t>0.9125 (91.25%)</w:t>
             </w:r>
           </w:p>
         </w:tc>
       </w:tr>
     </w:tbl>
-    <w:p/>
     <w:p>
       <w:pPr>
         <w:pStyle w:val="Heading2"/>
       </w:pPr>
       <w:r>
-        <w:t>5.1 Selection rationale</w:t>
-      </w:r>
-    </w:p>
-    <w:p>
-      <w:r>
-        <w:t>Random Forest was selected and saved as the final pipeline. In the recorded comparison it has the same accuracy as Logistic Regression, slightly higher precision, and slightly higher ROC-AUC, while its recall is lower. The selection is therefore based on the combined comparison rather than a claim that it dominates every metric.</w:t>
+        <w:t>4.1 Interpretation</w:t>
+      </w:r>
+    </w:p>
+    <w:p>
+      <w:r>
+        <w:t>Both models produced the same recorded accuracy. Random Forest achieved higher precision and a slightly higher ROC-AUC, while Logistic Regression achieved higher recall. The ROC-AUC difference is small, so model choice depends on the selection criterion and the precision/recall trade-off.</w:t>
       </w:r>
     </w:p>
     <w:p>
@@ -1530,12 +1809,15 @@
         <w:pStyle w:val="Heading2"/>
       </w:pPr>
       <w:r>
-        <w:t>5.2 Interpreting the results</w:t>
-      </w:r>
-    </w:p>
-    <w:p>
-      <w:r>
-        <w:t>These results are encouraging for a small demonstration dataset, but they are not evidence of readiness for clinical deployment. The test set is small, and a single split can produce uncertain estimates. Confidence intervals, repeated cross-validation, external validation, calibration, subgroup evaluation, and review of false negatives and false positives would be necessary for a stronger assessment.</w:t>
+        <w:t>4.2 Selected model</w:t>
+      </w:r>
+    </w:p>
+    <w:p>
+      <w:r>
+        <w:t xml:space="preserve">Random Forest was selected based on its slightly higher ROC-AUC and higher precision in the recorded results. This is a project-level choice, not a claim that Random Forest is always better for </w:t>
+      </w:r>
+      <w:r>
+        <w:t>this task.</w:t>
       </w:r>
     </w:p>
     <w:p>
@@ -1543,39 +1825,59 @@
         <w:pStyle w:val="Heading2"/>
       </w:pPr>
       <w:r>
-        <w:t>5.3 Saved artifacts</w:t>
+        <w:t>4.3 Limitations of comparison</w:t>
       </w:r>
     </w:p>
     <w:p>
       <w:pPr>
         <w:pStyle w:val="ListBullet"/>
-      </w:pPr>
-      <w:r>
-        <w:t>models/heart_disease_pipeline.joblib — selected pipeline used by the API.</w:t>
+        <w:spacing w:after="20"/>
+      </w:pPr>
+      <w:r>
+        <w:t>Metrics describe this experiment and are not universal performance estimates.</w:t>
       </w:r>
     </w:p>
     <w:p>
       <w:pPr>
         <w:pStyle w:val="ListBullet"/>
-      </w:pPr>
-      <w:r>
-        <w:t>models/logistic_regression.joblib — Logistic Regression artifact.</w:t>
+        <w:spacing w:after="20"/>
+      </w:pPr>
+      <w:r>
+        <w:t>Clinical use would require independent validation, calibration analysis, bias assessment, and domain-expert review.</w:t>
       </w:r>
     </w:p>
     <w:p>
       <w:pPr>
         <w:pStyle w:val="ListBullet"/>
-      </w:pPr>
-      <w:r>
-        <w:t>models/random_forest.joblib — Random Forest artifact.</w:t>
+        <w:spacing w:after="20"/>
+      </w:pPr>
+      <w:r>
+        <w:t>A decision threshold should reflect the relative costs of false positives and false negatives.</w:t>
       </w:r>
     </w:p>
     <w:p>
       <w:pPr>
         <w:pStyle w:val="ListBullet"/>
-      </w:pPr>
-      <w:r>
-        <w:t>reports/model_comparison.json — machine-readable metric comparison.</w:t>
+        <w:spacing w:after="20"/>
+      </w:pPr>
+      <w:r>
+        <w:t>The dataset is limited in size and may not represent broader populations or current practice.</w:t>
+      </w:r>
+    </w:p>
+    <w:p>
+      <w:pPr>
+        <w:pStyle w:val="Heading2"/>
+      </w:pPr>
+      <w:r>
+        <w:t>4.4 Result artifact</w:t>
+      </w:r>
+    </w:p>
+    <w:p>
+      <w:r>
+        <w:t xml:space="preserve">The comparison is preserved in </w:t>
+      </w:r>
+      <w:r>
+        <w:t>reports/model_comparison.json. Saved artifacts allow inference without retraining.</w:t>
       </w:r>
     </w:p>
     <w:p>
@@ -1589,15 +1891,7 @@
       </w:pPr>
       <w:r>
         <w:lastRenderedPageBreak/>
-        <w:t>6. Experiment Tracking with MLflow</w:t>
-      </w:r>
-    </w:p>
-    <w:p>
-      <w:r>
-        <w:t xml:space="preserve">MLflow is used to record model experiments and evaluation metrics. The configured experiment is named </w:t>
-      </w:r>
-      <w:r>
-        <w:t>heart-disease-classification, and the development environment used an SQLite tracking backend in mlflow.db.</w:t>
+        <w:t>5. Experiment Tracking with MLflow</w:t>
       </w:r>
     </w:p>
     <w:p>
@@ -1605,12 +1899,12 @@
         <w:pStyle w:val="Heading2"/>
       </w:pPr>
       <w:r>
-        <w:t>6.1 Tracked information</w:t>
-      </w:r>
-    </w:p>
-    <w:p>
-      <w:r>
-        <w:t>The workflow records model runs and metrics so candidate models can be compared after training. The project logs indicate that the Logistic Regression and Random Forest runs finished successfully. The database and MLflow run artifacts are development outputs and should be handled consistently with the repository's intended size and version-control policy.</w:t>
+        <w:t>5.1 Purpose</w:t>
+      </w:r>
+    </w:p>
+    <w:p>
+      <w:r>
+        <w:t>MLflow records training experiments and metrics. Tracking helps compare candidate runs, retain metadata, and associate evaluation results with each model candidate.</w:t>
       </w:r>
     </w:p>
     <w:p>
@@ -1618,39 +1912,12 @@
         <w:pStyle w:val="Heading2"/>
       </w:pPr>
       <w:r>
-        <w:t>6.2 Benefits</w:t>
-      </w:r>
-    </w:p>
-    <w:p>
-      <w:pPr>
-        <w:pStyle w:val="ListBullet"/>
-      </w:pPr>
-      <w:r>
-        <w:t>Makes candidate-model comparisons easier to inspect.</w:t>
-      </w:r>
-    </w:p>
-    <w:p>
-      <w:pPr>
-        <w:pStyle w:val="ListBullet"/>
-      </w:pPr>
-      <w:r>
-        <w:t>Keeps experiment metrics associated with individual runs.</w:t>
-      </w:r>
-    </w:p>
-    <w:p>
-      <w:pPr>
-        <w:pStyle w:val="ListBullet"/>
-      </w:pPr>
-      <w:r>
-        <w:t>Provides a basis for later recording parameters, dataset versions, and artifacts.</w:t>
-      </w:r>
-    </w:p>
-    <w:p>
-      <w:pPr>
-        <w:pStyle w:val="ListBullet"/>
-      </w:pPr>
-      <w:r>
-        <w:t>Improves transparency compared with keeping metrics only in terminal output.</w:t>
+        <w:t>5.2 Project configuration</w:t>
+      </w:r>
+    </w:p>
+    <w:p>
+      <w:r>
+        <w:t>The experiment name is heart-disease-classification. The tracking store uses the SQLite database mlflow.db, with an mlruns directory for associated run artifacts.</w:t>
       </w:r>
     </w:p>
     <w:p>
@@ -1658,52 +1925,7 @@
         <w:pStyle w:val="Heading2"/>
       </w:pPr>
       <w:r>
-        <w:t>6.3 Reproducing tracking</w:t>
-      </w:r>
-    </w:p>
-    <w:p>
-      <w:r>
-        <w:t>Activate the project's Python environment, install requirements, and execute the training script. Start the MLflow UI using the tracking configuration expected by the repository, then inspect the heart-disease-classification experiment. Use the actual tracking URI from the code/configuration; do not assume a particular browser URL if the VM's port forwarding is different.</w:t>
-      </w:r>
-    </w:p>
-    <w:p>
-      <w:pPr>
-        <w:pStyle w:val="Heading2"/>
-      </w:pPr>
-      <w:r>
-        <w:t>6.4 Evidence</w:t>
-      </w:r>
-    </w:p>
-    <w:p>
-      <w:r>
-        <w:t>For the final submission, capture a screenshot showing the experiment name, two completed runs, and the recorded metrics. Do not include secrets, tokens, or unrelated personal data in screenshots.</w:t>
-      </w:r>
-    </w:p>
-    <w:p>
-      <w:r>
-        <w:br w:type="page"/>
-      </w:r>
-    </w:p>
-    <w:p>
-      <w:pPr>
-        <w:pStyle w:val="Heading1"/>
-      </w:pPr>
-      <w:r>
-        <w:lastRenderedPageBreak/>
-        <w:t>7. FastAPI Inference Service</w:t>
-      </w:r>
-    </w:p>
-    <w:p>
-      <w:r>
-        <w:t>The application in src/api.py loads models/heart_disease_pipeline.joblib and exposes a JSON API using FastAPI. Uvicorn serves the application on port 8000.</w:t>
-      </w:r>
-    </w:p>
-    <w:p>
-      <w:pPr>
-        <w:pStyle w:val="Heading2"/>
-      </w:pPr>
-      <w:r>
-        <w:t>7.1 Endpoints</w:t>
+        <w:t>5.3 Recorded runs</w:t>
       </w:r>
     </w:p>
     <w:tbl>
@@ -1713,8 +1935,10 @@
         <w:tblLook w:val="04A0" w:firstRow="1" w:lastRow="0" w:firstColumn="1" w:lastColumn="0" w:noHBand="0" w:noVBand="1"/>
       </w:tblPr>
       <w:tblGrid>
-        <w:gridCol w:w="4968"/>
-        <w:gridCol w:w="4968"/>
+        <w:gridCol w:w="2520"/>
+        <w:gridCol w:w="2520"/>
+        <w:gridCol w:w="2520"/>
+        <w:gridCol w:w="2520"/>
       </w:tblGrid>
       <w:tr>
         <w:trPr>
@@ -1723,24 +1947,68 @@
         <w:tc>
           <w:tcPr>
             <w:cnfStyle w:val="001000000000" w:firstRow="0" w:lastRow="0" w:firstColumn="1" w:lastColumn="0" w:oddVBand="0" w:evenVBand="0" w:oddHBand="0" w:evenHBand="0" w:firstRowFirstColumn="0" w:firstRowLastColumn="0" w:lastRowFirstColumn="0" w:lastRowLastColumn="0"/>
-            <w:tcW w:w="4968" w:type="dxa"/>
+            <w:tcW w:w="2520" w:type="dxa"/>
           </w:tcPr>
           <w:p>
+            <w:pPr>
+              <w:spacing w:after="0"/>
+            </w:pPr>
             <w:r>
-              <w:t>Method and path</w:t>
+              <w:rPr>
+                <w:sz w:val="16"/>
+              </w:rPr>
+              <w:t>Model / run</w:t>
             </w:r>
           </w:p>
         </w:tc>
         <w:tc>
           <w:tcPr>
-            <w:tcW w:w="4968" w:type="dxa"/>
+            <w:tcW w:w="2520" w:type="dxa"/>
           </w:tcPr>
           <w:p>
             <w:pPr>
+              <w:spacing w:after="0"/>
               <w:cnfStyle w:val="100000000000" w:firstRow="1" w:lastRow="0" w:firstColumn="0" w:lastColumn="0" w:oddVBand="0" w:evenVBand="0" w:oddHBand="0" w:evenHBand="0" w:firstRowFirstColumn="0" w:firstRowLastColumn="0" w:lastRowFirstColumn="0" w:lastRowLastColumn="0"/>
             </w:pPr>
             <w:r>
-              <w:t>Purpose</w:t>
+              <w:rPr>
+                <w:sz w:val="16"/>
+              </w:rPr>
+              <w:t>Status</w:t>
+            </w:r>
+          </w:p>
+        </w:tc>
+        <w:tc>
+          <w:tcPr>
+            <w:tcW w:w="2520" w:type="dxa"/>
+          </w:tcPr>
+          <w:p>
+            <w:pPr>
+              <w:spacing w:after="0"/>
+              <w:cnfStyle w:val="100000000000" w:firstRow="1" w:lastRow="0" w:firstColumn="0" w:lastColumn="0" w:oddVBand="0" w:evenVBand="0" w:oddHBand="0" w:evenHBand="0" w:firstRowFirstColumn="0" w:firstRowLastColumn="0" w:lastRowFirstColumn="0" w:lastRowLastColumn="0"/>
+            </w:pPr>
+            <w:r>
+              <w:rPr>
+                <w:sz w:val="16"/>
+              </w:rPr>
+              <w:t>Accuracy</w:t>
+            </w:r>
+          </w:p>
+        </w:tc>
+        <w:tc>
+          <w:tcPr>
+            <w:tcW w:w="2520" w:type="dxa"/>
+          </w:tcPr>
+          <w:p>
+            <w:pPr>
+              <w:spacing w:after="0"/>
+              <w:cnfStyle w:val="100000000000" w:firstRow="1" w:lastRow="0" w:firstColumn="0" w:lastColumn="0" w:oddVBand="0" w:evenVBand="0" w:oddHBand="0" w:evenHBand="0" w:firstRowFirstColumn="0" w:firstRowLastColumn="0" w:lastRowFirstColumn="0" w:lastRowLastColumn="0"/>
+            </w:pPr>
+            <w:r>
+              <w:rPr>
+                <w:sz w:val="16"/>
+              </w:rPr>
+              <w:t>ROC-AUC</w:t>
             </w:r>
           </w:p>
         </w:tc>
@@ -1752,24 +2020,68 @@
         <w:tc>
           <w:tcPr>
             <w:cnfStyle w:val="001000000000" w:firstRow="0" w:lastRow="0" w:firstColumn="1" w:lastColumn="0" w:oddVBand="0" w:evenVBand="0" w:oddHBand="0" w:evenHBand="0" w:firstRowFirstColumn="0" w:firstRowLastColumn="0" w:lastRowFirstColumn="0" w:lastRowLastColumn="0"/>
-            <w:tcW w:w="4968" w:type="dxa"/>
+            <w:tcW w:w="2520" w:type="dxa"/>
           </w:tcPr>
           <w:p>
+            <w:pPr>
+              <w:spacing w:after="0"/>
+            </w:pPr>
             <w:r>
-              <w:t>GET /health</w:t>
+              <w:rPr>
+                <w:sz w:val="16"/>
+              </w:rPr>
+              <w:t>random_forest</w:t>
             </w:r>
           </w:p>
         </w:tc>
         <w:tc>
           <w:tcPr>
-            <w:tcW w:w="4968" w:type="dxa"/>
+            <w:tcW w:w="2520" w:type="dxa"/>
           </w:tcPr>
           <w:p>
             <w:pPr>
+              <w:spacing w:after="0"/>
               <w:cnfStyle w:val="000000100000" w:firstRow="0" w:lastRow="0" w:firstColumn="0" w:lastColumn="0" w:oddVBand="0" w:evenVBand="0" w:oddHBand="1" w:evenHBand="0" w:firstRowFirstColumn="0" w:firstRowLastColumn="0" w:lastRowFirstColumn="0" w:lastRowLastColumn="0"/>
             </w:pPr>
             <w:r>
-              <w:t>Returns application health and whether the model is loaded.</w:t>
+              <w:rPr>
+                <w:sz w:val="16"/>
+              </w:rPr>
+              <w:t>FINISHED</w:t>
+            </w:r>
+          </w:p>
+        </w:tc>
+        <w:tc>
+          <w:tcPr>
+            <w:tcW w:w="2520" w:type="dxa"/>
+          </w:tcPr>
+          <w:p>
+            <w:pPr>
+              <w:spacing w:after="0"/>
+              <w:cnfStyle w:val="000000100000" w:firstRow="0" w:lastRow="0" w:firstColumn="0" w:lastColumn="0" w:oddVBand="0" w:evenVBand="0" w:oddHBand="1" w:evenHBand="0" w:firstRowFirstColumn="0" w:firstRowLastColumn="0" w:lastRowFirstColumn="0" w:lastRowLastColumn="0"/>
+            </w:pPr>
+            <w:r>
+              <w:rPr>
+                <w:sz w:val="16"/>
+              </w:rPr>
+              <w:t>0.8349</w:t>
+            </w:r>
+          </w:p>
+        </w:tc>
+        <w:tc>
+          <w:tcPr>
+            <w:tcW w:w="2520" w:type="dxa"/>
+          </w:tcPr>
+          <w:p>
+            <w:pPr>
+              <w:spacing w:after="0"/>
+              <w:cnfStyle w:val="000000100000" w:firstRow="0" w:lastRow="0" w:firstColumn="0" w:lastColumn="0" w:oddVBand="0" w:evenVBand="0" w:oddHBand="1" w:evenHBand="0" w:firstRowFirstColumn="0" w:firstRowLastColumn="0" w:lastRowFirstColumn="0" w:lastRowLastColumn="0"/>
+            </w:pPr>
+            <w:r>
+              <w:rPr>
+                <w:sz w:val="16"/>
+              </w:rPr>
+              <w:t>0.9125</w:t>
             </w:r>
           </w:p>
         </w:tc>
@@ -1778,73 +2090,132 @@
         <w:tc>
           <w:tcPr>
             <w:cnfStyle w:val="001000000000" w:firstRow="0" w:lastRow="0" w:firstColumn="1" w:lastColumn="0" w:oddVBand="0" w:evenVBand="0" w:oddHBand="0" w:evenHBand="0" w:firstRowFirstColumn="0" w:firstRowLastColumn="0" w:lastRowFirstColumn="0" w:lastRowLastColumn="0"/>
-            <w:tcW w:w="4968" w:type="dxa"/>
+            <w:tcW w:w="2520" w:type="dxa"/>
           </w:tcPr>
           <w:p>
+            <w:pPr>
+              <w:spacing w:after="0"/>
+            </w:pPr>
             <w:r>
-              <w:t>POST /predict</w:t>
+              <w:rPr>
+                <w:sz w:val="16"/>
+              </w:rPr>
+              <w:t>logistic_regression</w:t>
             </w:r>
           </w:p>
         </w:tc>
         <w:tc>
           <w:tcPr>
-            <w:tcW w:w="4968" w:type="dxa"/>
+            <w:tcW w:w="2520" w:type="dxa"/>
           </w:tcPr>
           <w:p>
             <w:pPr>
+              <w:spacing w:after="0"/>
               <w:cnfStyle w:val="000000000000" w:firstRow="0" w:lastRow="0" w:firstColumn="0" w:lastColumn="0" w:oddVBand="0" w:evenVBand="0" w:oddHBand="0" w:evenHBand="0" w:firstRowFirstColumn="0" w:firstRowLastColumn="0" w:lastRowFirstColumn="0" w:lastRowLastColumn="0"/>
             </w:pPr>
             <w:r>
-              <w:t>Validates patient attributes and returns a prediction and probability when available.</w:t>
-            </w:r>
-          </w:p>
-        </w:tc>
-      </w:tr>
-      <w:tr>
-        <w:trPr>
-          <w:cnfStyle w:val="000000100000" w:firstRow="0" w:lastRow="0" w:firstColumn="0" w:lastColumn="0" w:oddVBand="0" w:evenVBand="0" w:oddHBand="1" w:evenHBand="0" w:firstRowFirstColumn="0" w:firstRowLastColumn="0" w:lastRowFirstColumn="0" w:lastRowLastColumn="0"/>
-        </w:trPr>
-        <w:tc>
-          <w:tcPr>
-            <w:cnfStyle w:val="001000000000" w:firstRow="0" w:lastRow="0" w:firstColumn="1" w:lastColumn="0" w:oddVBand="0" w:evenVBand="0" w:oddHBand="0" w:evenHBand="0" w:firstRowFirstColumn="0" w:firstRowLastColumn="0" w:lastRowFirstColumn="0" w:lastRowLastColumn="0"/>
-            <w:tcW w:w="4968" w:type="dxa"/>
-          </w:tcPr>
-          <w:p>
-            <w:r>
-              <w:t xml:space="preserve">GET </w:t>
-            </w:r>
-            <w:r>
-              <w:t>/docs</w:t>
+              <w:rPr>
+                <w:sz w:val="16"/>
+              </w:rPr>
+              <w:t>FINISHED</w:t>
             </w:r>
           </w:p>
         </w:tc>
         <w:tc>
           <w:tcPr>
-            <w:tcW w:w="4968" w:type="dxa"/>
+            <w:tcW w:w="2520" w:type="dxa"/>
           </w:tcPr>
           <w:p>
             <w:pPr>
-              <w:cnfStyle w:val="000000100000" w:firstRow="0" w:lastRow="0" w:firstColumn="0" w:lastColumn="0" w:oddVBand="0" w:evenVBand="0" w:oddHBand="1" w:evenHBand="0" w:firstRowFirstColumn="0" w:firstRowLastColumn="0" w:lastRowFirstColumn="0" w:lastRowLastColumn="0"/>
+              <w:spacing w:after="0"/>
+              <w:cnfStyle w:val="000000000000" w:firstRow="0" w:lastRow="0" w:firstColumn="0" w:lastColumn="0" w:oddVBand="0" w:evenVBand="0" w:oddHBand="0" w:evenHBand="0" w:firstRowFirstColumn="0" w:firstRowLastColumn="0" w:lastRowFirstColumn="0" w:lastRowLastColumn="0"/>
             </w:pPr>
             <w:r>
-              <w:t>FastAPI interactive API documentation, when accessible.</w:t>
+              <w:rPr>
+                <w:sz w:val="16"/>
+              </w:rPr>
+              <w:t>0.8349</w:t>
+            </w:r>
+          </w:p>
+        </w:tc>
+        <w:tc>
+          <w:tcPr>
+            <w:tcW w:w="2520" w:type="dxa"/>
+          </w:tcPr>
+          <w:p>
+            <w:pPr>
+              <w:spacing w:after="0"/>
+              <w:cnfStyle w:val="000000000000" w:firstRow="0" w:lastRow="0" w:firstColumn="0" w:lastColumn="0" w:oddVBand="0" w:evenVBand="0" w:oddHBand="0" w:evenHBand="0" w:firstRowFirstColumn="0" w:firstRowLastColumn="0" w:lastRowFirstColumn="0" w:lastRowLastColumn="0"/>
+            </w:pPr>
+            <w:r>
+              <w:rPr>
+                <w:sz w:val="16"/>
+              </w:rPr>
+              <w:t>0.9099</w:t>
             </w:r>
           </w:p>
         </w:tc>
       </w:tr>
     </w:tbl>
-    <w:p/>
+    <w:p>
+      <w:r>
+        <w:t>The recorded experiment query returned two finished runs. Their metrics support comparison through the MLflow UI or programmatic queries.</w:t>
+      </w:r>
+    </w:p>
     <w:p>
       <w:pPr>
         <w:pStyle w:val="Heading2"/>
       </w:pPr>
       <w:r>
-        <w:t>7.2 Request validation</w:t>
-      </w:r>
-    </w:p>
-    <w:p>
-      <w:r>
-        <w:t>The PatientData request model validates the expected attributes, including age, sex, chest-pain type, resting blood pressure, cholesterol, fasting blood sugar, resting ECG, maximum heart rate, exercise-induced angina, oldpeak, slope, ca, and thal. Integer categories and numeric bounds help reject malformed requests before model inference.</w:t>
+        <w:t xml:space="preserve">5.4 </w:t>
+      </w:r>
+      <w:r>
+        <w:t>Reproducibility and governance</w:t>
+      </w:r>
+    </w:p>
+    <w:p>
+      <w:pPr>
+        <w:pStyle w:val="ListBullet"/>
+        <w:spacing w:after="20"/>
+      </w:pPr>
+      <w:r>
+        <w:t>Log model parameters and evaluation metrics for every run.</w:t>
+      </w:r>
+    </w:p>
+    <w:p>
+      <w:pPr>
+        <w:pStyle w:val="ListBullet"/>
+        <w:spacing w:after="20"/>
+      </w:pPr>
+      <w:r>
+        <w:t>Record model names and configuration such as random seed and cross-validation folds.</w:t>
+      </w:r>
+    </w:p>
+    <w:p>
+      <w:pPr>
+        <w:pStyle w:val="ListBullet"/>
+        <w:spacing w:after="20"/>
+      </w:pPr>
+      <w:r>
+        <w:t>Keep artifacts and comparison outputs associated with the project.</w:t>
+      </w:r>
+    </w:p>
+    <w:p>
+      <w:pPr>
+        <w:pStyle w:val="ListBullet"/>
+        <w:spacing w:after="20"/>
+      </w:pPr>
+      <w:r>
+        <w:t>Use stable experiment naming to locate runs.</w:t>
+      </w:r>
+    </w:p>
+    <w:p>
+      <w:pPr>
+        <w:pStyle w:val="ListBullet"/>
+        <w:spacing w:after="20"/>
+      </w:pPr>
+      <w:r>
+        <w:t>Avoid storing credentials or sensitive patient information in tracking metadata.</w:t>
       </w:r>
     </w:p>
     <w:p>
@@ -1852,45 +2223,122 @@
         <w:pStyle w:val="Heading2"/>
       </w:pPr>
       <w:r>
-        <w:t>7.3 Observed API tests</w:t>
-      </w:r>
-    </w:p>
-    <w:p>
-      <w:r>
-        <w:t>The following health response was observed in the development environment:</w:t>
-      </w:r>
-    </w:p>
-    <w:p>
-      <w:r>
+        <w:t>5.5 Practical note</w:t>
+      </w:r>
+    </w:p>
+    <w:p>
+      <w:r>
+        <w:t>The tracking UI can be launched from the project environment using the SQLite backend. Port forwarding depends on the Prayogshala VM. If the UI is unavailable, reports/model_comparison.json provides a portable comparison summary.</w:t>
+      </w:r>
+    </w:p>
+    <w:p>
+      <w:r>
+        <w:br w:type="page"/>
+      </w:r>
+    </w:p>
+    <w:p>
+      <w:pPr>
+        <w:pStyle w:val="Heading1"/>
+      </w:pPr>
+      <w:r>
+        <w:lastRenderedPageBreak/>
+        <w:t>6. Model Serving through REST API</w:t>
+      </w:r>
+    </w:p>
+    <w:p>
+      <w:pPr>
+        <w:pStyle w:val="Heading2"/>
+      </w:pPr>
+      <w:r>
+        <w:t>6.1 API purpose</w:t>
+      </w:r>
+    </w:p>
+    <w:p>
+      <w:r>
+        <w:t>The project exposes inference through src/api.py. A REST API separates training from prediction clients and provides a consistent interface for sending feature values and receiving a response.</w:t>
+      </w:r>
+    </w:p>
+    <w:p>
+      <w:pPr>
+        <w:pStyle w:val="Heading2"/>
+      </w:pPr>
+      <w:r>
+        <w:t>6.2 Health endpoint</w:t>
+      </w:r>
+    </w:p>
+    <w:p>
+      <w:r>
+        <w:t>The GET /health endpoint checks whether the service is running and whether the model has loaded. A previously verified response was:</w:t>
+      </w:r>
+    </w:p>
+    <w:p>
+      <w:pPr>
+        <w:ind w:left="288"/>
+      </w:pPr>
+      <w:r>
+        <w:rPr>
+          <w:rFonts w:ascii="Consolas" w:hAnsi="Consolas"/>
+          <w:sz w:val="16"/>
+        </w:rPr>
         <w:t>{"status":"healthy","model_loaded":true}</w:t>
       </w:r>
     </w:p>
     <w:p>
-      <w:r>
-        <w:t>A sample prediction request returned:</w:t>
-      </w:r>
-    </w:p>
-    <w:p>
+      <w:pPr>
+        <w:pStyle w:val="Heading2"/>
+      </w:pPr>
+      <w:r>
+        <w:t>6.3 Prediction endpoint</w:t>
+      </w:r>
+    </w:p>
+    <w:p>
+      <w:r>
+        <w:t>POST /predict accepts feature values as JSON. A previously tested sample returned prediction 0, interpretation 'heart disease not detected by model', and probability_class_1 0.3267.</w:t>
+      </w:r>
+    </w:p>
+    <w:p>
+      <w:pPr>
+        <w:ind w:left="288"/>
+      </w:pPr>
       <w:r>
         <w:t>{"prediction":0,"interpretation":"heart disease not detected by model","probability_class_1":0.3267}</w:t>
       </w:r>
     </w:p>
     <w:p>
-      <w:r>
-        <w:t>This is an example of the API's response format, not a clinical interpretation. The probability is model output and must not be treated as an individual's medically validated risk.</w:t>
-      </w:r>
-    </w:p>
-    <w:p>
       <w:pPr>
         <w:pStyle w:val="Heading2"/>
       </w:pPr>
       <w:r>
-        <w:t>7.4 Local verification</w:t>
-      </w:r>
-    </w:p>
-    <w:p>
-      <w:r>
-        <w:t>Run the API from the project environment and use curl or the interactive /docs page to exercise the health and prediction endpoints. Confirm that a valid request returns JSON and that invalid inputs are rejected by validation.</w:t>
+        <w:t>6.4 Example request</w:t>
+      </w:r>
+    </w:p>
+    <w:p>
+      <w:pPr>
+        <w:ind w:left="288"/>
+      </w:pPr>
+      <w:r>
+        <w:t>curl -X POST http://localhost:8001/predict \</w:t>
+      </w:r>
+      <w:r>
+        <w:br/>
+        <w:t xml:space="preserve">  -H "Content-Type: application/json" \</w:t>
+      </w:r>
+      <w:r>
+        <w:br/>
+        <w:t xml:space="preserve">  -d '{"age":63,"sex":1,"cp":3,"trestbps":145,"chol":233,"fbs":1,"restecg":0,"thalach":150,"exang":0,"oldpeak":2.3,"slope":2,"ca":0,"thal":3}'</w:t>
+      </w:r>
+    </w:p>
+    <w:p>
+      <w:pPr>
+        <w:pStyle w:val="Heading2"/>
+      </w:pPr>
+      <w:r>
+        <w:t>6.5 Safety and limitations</w:t>
+      </w:r>
+    </w:p>
+    <w:p>
+      <w:r>
+        <w:t>This API is an educational demonstration. The returned class and probability are model outputs, not a diagnosis or medical recommendation. Real-world use would require extensive validation, privacy controls, security review, monitoring, and applicable regulatory assessment.</w:t>
       </w:r>
     </w:p>
     <w:p>
@@ -1904,7 +2352,7 @@
       </w:pPr>
       <w:r>
         <w:lastRenderedPageBreak/>
-        <w:t>8. Testing, CI, and Containerization</w:t>
+        <w:t>7. Testing, Quality Checks, and Continuous Integration</w:t>
       </w:r>
     </w:p>
     <w:p>
@@ -1912,12 +2360,12 @@
         <w:pStyle w:val="Heading2"/>
       </w:pPr>
       <w:r>
-        <w:t>8.1 Automated tests and static checks</w:t>
-      </w:r>
-    </w:p>
-    <w:p>
-      <w:r>
-        <w:t>The repository includes tests/test_api.py and a GitHub Actions workflow at .github/workflows/ci.yml. The workflow installs dependencies, runs Ruff linting, checks formatting, and executes pytest. Earlier development checks reported three passing tests and a green GitHub Actions run; verify the latest workflow status before submission.</w:t>
+        <w:t>7.1 Automated tests</w:t>
+      </w:r>
+    </w:p>
+    <w:p>
+      <w:r>
+        <w:t>The project includes tests/test_api.py and pytest configuration. The previously recorded local test run passed three tests. Automated tests help detect regressions in API behavior and expected application functionality.</w:t>
       </w:r>
     </w:p>
     <w:p>
@@ -1925,12 +2373,51 @@
         <w:pStyle w:val="Heading2"/>
       </w:pPr>
       <w:r>
-        <w:t>8.2 Docker image</w:t>
-      </w:r>
-    </w:p>
-    <w:p>
-      <w:r>
-        <w:t>The Dockerfile uses python:3.12-slim, installs the runtime dependencies, copies the API source and saved model, exposes port 8000, and starts Uvicorn. The .dockerignore file excludes development environments, caches, datasets, reports, and other non-runtime files from the build context.</w:t>
+        <w:t>7.2 Static checks and formatting</w:t>
+      </w:r>
+    </w:p>
+    <w:p>
+      <w:r>
+        <w:t xml:space="preserve">Ruff is used for linting and formatting </w:t>
+      </w:r>
+      <w:r>
+        <w:t>checks. The project commands are:</w:t>
+      </w:r>
+    </w:p>
+    <w:p>
+      <w:pPr>
+        <w:ind w:left="288"/>
+      </w:pPr>
+      <w:r>
+        <w:rPr>
+          <w:rFonts w:ascii="Consolas" w:hAnsi="Consolas"/>
+          <w:sz w:val="16"/>
+        </w:rPr>
+        <w:t>ruff check src tests</w:t>
+      </w:r>
+    </w:p>
+    <w:p>
+      <w:pPr>
+        <w:ind w:left="288"/>
+      </w:pPr>
+      <w:r>
+        <w:rPr>
+          <w:rFonts w:ascii="Consolas" w:hAnsi="Consolas"/>
+          <w:sz w:val="16"/>
+        </w:rPr>
+        <w:t>ruff format --check src tests</w:t>
+      </w:r>
+    </w:p>
+    <w:p>
+      <w:pPr>
+        <w:ind w:left="288"/>
+      </w:pPr>
+      <w:r>
+        <w:rPr>
+          <w:rFonts w:ascii="Consolas" w:hAnsi="Consolas"/>
+          <w:sz w:val="16"/>
+        </w:rPr>
+        <w:t>python -m pytest -v</w:t>
       </w:r>
     </w:p>
     <w:p>
@@ -1938,77 +2425,190 @@
         <w:pStyle w:val="Heading2"/>
       </w:pPr>
       <w:r>
-        <w:t>8.3 Docker Compose</w:t>
-      </w:r>
-    </w:p>
-    <w:p>
-      <w:r>
-        <w:t>The docker-compose.yml file defines the API service, publishes host port 8001 to container port 8000, configures a restart policy, and checks the /health endpoint. The API was tested successfully through Docker Compose in the development VM.</w:t>
-      </w:r>
-      <w:r/>
+        <w:t>7.3 GitHub Actions workflow</w:t>
+      </w:r>
+    </w:p>
+    <w:p>
+      <w:r>
+        <w:t>The workflow is stored in .github/workflows/ci.yml. It checks out the repository, sets up Python 3.12, installs dependencies, runs Ruff linting, checks formatting, and executes the test suite.</w:t>
+      </w:r>
     </w:p>
     <w:p>
       <w:pPr>
         <w:pStyle w:val="Heading2"/>
       </w:pPr>
       <w:r>
-        <w:t>8.4 Useful commands</w:t>
+        <w:t>7.4 CI value</w:t>
       </w:r>
     </w:p>
     <w:p>
       <w:pPr>
         <w:pStyle w:val="ListBullet"/>
-      </w:pPr>
-      <w:r>
-        <w:t>docker compose up -d --build — build and start the service.</w:t>
+        <w:spacing w:after="20"/>
+      </w:pPr>
+      <w:r>
+        <w:t>Runs checks automatically for pushes and pull requests targeting main.</w:t>
       </w:r>
     </w:p>
     <w:p>
       <w:pPr>
         <w:pStyle w:val="ListBullet"/>
-      </w:pPr>
-      <w:r>
-        <w:t>docker compose ps — inspect container status.</w:t>
+        <w:spacing w:after="20"/>
+      </w:pPr>
+      <w:r>
+        <w:t>Provides visible pass/fail feedback in the repository Actions page.</w:t>
       </w:r>
     </w:p>
     <w:p>
       <w:pPr>
         <w:pStyle w:val="ListBullet"/>
-      </w:pPr>
-      <w:r>
-        <w:t>docker compose logs --tail=50 — inspect startup logs.</w:t>
+        <w:spacing w:after="20"/>
+      </w:pPr>
+      <w:r>
+        <w:t>Reduces reliance on manual checks and helps detect regressions.</w:t>
       </w:r>
     </w:p>
     <w:p>
       <w:pPr>
         <w:pStyle w:val="ListBullet"/>
-      </w:pPr>
-      <w:r>
-        <w:t>curl http://localhost:8001/health — verify the Docker Compose health endpoint.</w:t>
+        <w:spacing w:after="20"/>
+      </w:pPr>
+      <w:r>
+        <w:t>Creates a repeatable quality gate before changes are merged.</w:t>
+      </w:r>
+    </w:p>
+    <w:p>
+      <w:pPr>
+        <w:pStyle w:val="Heading2"/>
+      </w:pPr>
+      <w:r>
+        <w:t>7.5 Repository and delivery</w:t>
+      </w:r>
+    </w:p>
+    <w:p>
+      <w:r>
+        <w:t>Repository: https://github.com/Jyoti2025BITS/heart-disease-mlops. Review the latest Actions run before submission to ensure the latest commit passed. Upload the demo video to the location required by course instructions.</w:t>
+      </w:r>
+    </w:p>
+    <w:p>
+      <w:r>
+        <w:br w:type="page"/>
+      </w:r>
+    </w:p>
+    <w:p>
+      <w:pPr>
+        <w:pStyle w:val="Heading2"/>
+        <w:spacing w:after="80"/>
+      </w:pPr>
+      <w:r>
+        <w:lastRenderedPageBreak/>
+        <w:t>Docker Compose validation</w:t>
+      </w:r>
+    </w:p>
+    <w:p>
+      <w:pPr>
+        <w:spacing w:after="80"/>
+      </w:pPr>
+      <w:r>
+        <w:t xml:space="preserve">Docker Compose was observed in a healthy state with host port 8001 mapped to container port 8000. The /health endpoint returned HTTP 200 </w:t>
+      </w:r>
+      <w:r>
+        <w:t>with status healthy and model_loaded true. The /metrics endpoint returned Prometheus-format metrics.</w:t>
+      </w:r>
+    </w:p>
+    <w:p>
+      <w:pPr>
+        <w:pStyle w:val="Heading2"/>
+        <w:spacing w:after="80"/>
+      </w:pPr>
+      <w:r>
+        <w:t>Local Minikube validation</w:t>
+      </w:r>
+    </w:p>
+    <w:p>
+      <w:pPr>
+        <w:spacing w:after="80"/>
+      </w:pPr>
+      <w:r>
+        <w:t>The Kubernetes deployment reached 1/1 available replicas. The pod was Running with zero restarts, and the heart-disease-api ClusterIP service exposed port 8000/TCP. Port forwarding from localhost:8002 to service port 8000 enabled health and prediction requests to be verified.</w:t>
+      </w:r>
+    </w:p>
+    <w:p>
+      <w:pPr>
+        <w:spacing w:after="80"/>
+      </w:pPr>
+      <w:r>
+        <w:t>These checks establish local development-environment validation only. They do not establish a public URL, remote-cluster deployment, production security, scalability, or clinical suitability.</w:t>
+      </w:r>
+    </w:p>
+    <w:p>
+      <w:pPr>
+        <w:pStyle w:val="Heading1"/>
+      </w:pPr>
+      <w:r>
+        <w:t>8. Conclusion, Limitations, and Future Work</w:t>
+      </w:r>
+    </w:p>
+    <w:p>
+      <w:pPr>
+        <w:pStyle w:val="Heading2"/>
+      </w:pPr>
+      <w:r>
+        <w:t>8.1 Conclusion</w:t>
+      </w:r>
+    </w:p>
+    <w:p>
+      <w:r>
+        <w:t>This project demonstrates an end-to-end MLOps workflow for a heart disease classification use case. It combines data inspection and EDA with model comparison, MLflow experiment tracking, saved model artifacts, a REST API, automated tests, and GitHub Actions.</w:t>
+      </w:r>
+    </w:p>
+    <w:p>
+      <w:r>
+        <w:t>Random Forest was selected because it achieved slightly higher ROC-AUC and precision than Logistic Regression, while both had the same accuracy. The selected pipeline is models/heart_disease_pipeline.joblib, and the comparison is preserved in reports/model_comparison.json.</w:t>
+      </w:r>
+    </w:p>
+    <w:p>
+      <w:pPr>
+        <w:pStyle w:val="Heading2"/>
+      </w:pPr>
+      <w:r>
+        <w:t>8.2 Current limitations</w:t>
       </w:r>
     </w:p>
     <w:p>
       <w:pPr>
         <w:pStyle w:val="ListBullet"/>
-      </w:pPr>
-      <w:r>
-        <w:t>python -m pytest -v — run automated tests.</w:t>
+        <w:spacing w:after="20"/>
+      </w:pPr>
+      <w:r>
+        <w:t>The dataset contains only 303 records and may not represent other populations.</w:t>
       </w:r>
     </w:p>
     <w:p>
       <w:pPr>
         <w:pStyle w:val="ListBullet"/>
-      </w:pPr>
-      <w:r>
-        <w:t>ruff check src tests — run lint checks.</w:t>
+        <w:spacing w:after="20"/>
+      </w:pPr>
+      <w:r>
+        <w:t>Recorded metrics do not establish clinical validity.</w:t>
       </w:r>
     </w:p>
     <w:p>
       <w:pPr>
         <w:pStyle w:val="ListBullet"/>
-      </w:pPr>
-      <w:r>
-        <w:t>ruff format --check src tests — check formatting.</w:t>
+        <w:spacing w:after="20"/>
+      </w:pPr>
+      <w:r>
+        <w:t>A local Minikube deployment was validated; production or externally hosted Kubernetes deployment, authentication, and load testing are not claimed here.</w:t>
+      </w:r>
+    </w:p>
+    <w:p>
+      <w:pPr>
+        <w:pStyle w:val="ListBullet"/>
+        <w:spacing w:after="20"/>
+      </w:pPr>
+      <w:r>
+        <w:t>Predictions should not be used for diagnosis or treatment decisions.</w:t>
       </w:r>
     </w:p>
     <w:p>
@@ -2016,29 +2616,80 @@
         <w:pStyle w:val="Heading2"/>
       </w:pPr>
       <w:r>
-        <w:t>8.5 Reproducibility and versioning</w:t>
-      </w:r>
-    </w:p>
-    <w:p>
-      <w:r>
-        <w:t xml:space="preserve">For a more repeatable </w:t>
-      </w:r>
-      <w:r>
-        <w:t>production build, pin dependency versions and ensure the installed scikit-learn version matches the version used to serialize the model. Rebuild and re-test the container after dependency or model changes.</w:t>
-      </w:r>
-    </w:p>
-    <w:p>
-      <w:r>
-        <w:br w:type="page"/>
+        <w:t>8.3 Future improvements</w:t>
+      </w:r>
+    </w:p>
+    <w:p>
+      <w:pPr>
+        <w:pStyle w:val="ListBullet"/>
+        <w:spacing w:after="20"/>
+      </w:pPr>
+      <w:r>
+        <w:t>Add explicit data and model versioning and document dataset provenance.</w:t>
+      </w:r>
+    </w:p>
+    <w:p>
+      <w:pPr>
+        <w:pStyle w:val="ListBullet"/>
+        <w:spacing w:after="20"/>
+      </w:pPr>
+      <w:r>
+        <w:t>Validate schema drift and data quality at inference time.</w:t>
+      </w:r>
+    </w:p>
+    <w:p>
+      <w:pPr>
+        <w:pStyle w:val="ListBullet"/>
+        <w:spacing w:after="20"/>
+      </w:pPr>
+      <w:r>
+        <w:t>Evaluate probability calibration and threshold selection.</w:t>
+      </w:r>
+    </w:p>
+    <w:p>
+      <w:pPr>
+        <w:pStyle w:val="ListBullet"/>
+        <w:spacing w:after="20"/>
+      </w:pPr>
+      <w:r>
+        <w:t>Add API integration, error-path, and load tests.</w:t>
+      </w:r>
+    </w:p>
+    <w:p>
+      <w:pPr>
+        <w:pStyle w:val="ListBullet"/>
+        <w:spacing w:after="20"/>
+      </w:pPr>
+      <w:r>
+        <w:t>Add structured logging, service metrics, and model-performance monitoring.</w:t>
+      </w:r>
+    </w:p>
+    <w:p>
+      <w:pPr>
+        <w:pStyle w:val="ListBullet"/>
+        <w:spacing w:after="20"/>
+      </w:pPr>
+      <w:r>
+        <w:t>Publish the container image to a registry and validate deployment, rollback, and operations on a remote Kubernetes cluster.</w:t>
+      </w:r>
+    </w:p>
+    <w:p>
+      <w:pPr>
+        <w:pStyle w:val="ListBullet"/>
+        <w:spacing w:after="20"/>
+      </w:pPr>
+      <w:r>
+        <w:t>Perform independent validation and fairness assessment before real-world use.</w:t>
       </w:r>
     </w:p>
     <w:p>
       <w:pPr>
         <w:pStyle w:val="Heading1"/>
+        <w:pageBreakBefore/>
       </w:pPr>
       <w:r>
         <w:lastRenderedPageBreak/>
-        <w:t>9. Deployment Status, Limitations, and Conclusion</w:t>
+        <w:t>Supporting Screenshot Evidence</w:t>
       </w:r>
     </w:p>
     <w:p>
@@ -2046,160 +2697,178 @@
         <w:pStyle w:val="Heading2"/>
       </w:pPr>
       <w:r>
-        <w:t>9.1 Kubernetes configuration</w:t>
-      </w:r>
-    </w:p>
-    <w:p>
-      <w:r>
-        <w:t>The repository contains deployment/deployment.yaml and deployment/service.yaml. These manifests were applied successfully to a local Minikube Kubernetes cluster. The heart-disease-api Deployment reached 1/1 available replicas, and its pod was Running with zero restarts during validation. The ClusterIP Service exposes port 8000 internally. The /health endpoint returned HTTP 200 with {"status":"healthy","model_loaded":true}, and a POST request to /predict returned a valid JSON prediction. Testing used port forwarding from local port 8002 to service port 8000. This validates a local Minikube deployment, not a production or externally accessible cluster. A remote cluster would also need access to the image, normally through a registry.</w:t>
-      </w:r>
-      <w:r/>
+        <w:t>Exploratory data analysis</w:t>
+      </w:r>
+    </w:p>
+    <w:p>
+      <w:pPr>
+        <w:jc w:val="center"/>
+      </w:pPr>
+      <w:r>
+        <w:rPr>
+          <w:noProof/>
+        </w:rPr>
+        <w:drawing>
+          <wp:inline distT="0" distB="0" distL="0" distR="0" wp14:anchorId="6ADD7F02" wp14:editId="4E5E62D1">
+            <wp:extent cx="5669280" cy="3864317"/>
+            <wp:effectExtent l="0" t="0" r="0" b="0"/>
+            <wp:docPr id="1" name="Picture 1"/>
+            <wp:cNvGraphicFramePr>
+              <a:graphicFrameLocks xmlns:a="http://schemas.openxmlformats.org/drawingml/2006/main" noChangeAspect="1"/>
+            </wp:cNvGraphicFramePr>
+            <a:graphic xmlns:a="http://schemas.openxmlformats.org/drawingml/2006/main">
+              <a:graphicData uri="http://schemas.openxmlformats.org/drawingml/2006/picture">
+                <pic:pic xmlns:pic="http://schemas.openxmlformats.org/drawingml/2006/picture">
+                  <pic:nvPicPr>
+                    <pic:cNvPr id="0" name="eda_montage.jpg"/>
+                    <pic:cNvPicPr/>
+                  </pic:nvPicPr>
+                  <pic:blipFill>
+                    <a:blip r:embed="rId8"/>
+                    <a:stretch>
+                      <a:fillRect/>
+                    </a:stretch>
+                  </pic:blipFill>
+                  <pic:spPr>
+                    <a:xfrm>
+                      <a:off x="0" y="0"/>
+                      <a:ext cx="5669280" cy="3864317"/>
+                    </a:xfrm>
+                    <a:prstGeom prst="rect">
+                      <a:avLst/>
+                    </a:prstGeom>
+                  </pic:spPr>
+                </pic:pic>
+              </a:graphicData>
+            </a:graphic>
+          </wp:inline>
+        </w:drawing>
+      </w:r>
     </w:p>
     <w:p>
       <w:pPr>
         <w:pStyle w:val="Heading2"/>
-      </w:pPr>
-      <w:r>
-        <w:t>9.2 Limitations</w:t>
+        <w:pageBreakBefore/>
+      </w:pPr>
+      <w:r>
+        <w:lastRenderedPageBreak/>
+        <w:t>Deployment and API validation</w:t>
+      </w:r>
+    </w:p>
+    <w:p>
+      <w:pPr>
+        <w:jc w:val="center"/>
+      </w:pPr>
+      <w:r>
+        <w:rPr>
+          <w:noProof/>
+        </w:rPr>
+        <w:drawing>
+          <wp:inline distT="0" distB="0" distL="0" distR="0" wp14:anchorId="1601C5C5" wp14:editId="5D0CC1E0">
+            <wp:extent cx="5669280" cy="3864317"/>
+            <wp:effectExtent l="0" t="0" r="0" b="0"/>
+            <wp:docPr id="2" name="Picture 2"/>
+            <wp:cNvGraphicFramePr>
+              <a:graphicFrameLocks xmlns:a="http://schemas.openxmlformats.org/drawingml/2006/main" noChangeAspect="1"/>
+            </wp:cNvGraphicFramePr>
+            <a:graphic xmlns:a="http://schemas.openxmlformats.org/drawingml/2006/main">
+              <a:graphicData uri="http://schemas.openxmlformats.org/drawingml/2006/picture">
+                <pic:pic xmlns:pic="http://schemas.openxmlformats.org/drawingml/2006/picture">
+                  <pic:nvPicPr>
+                    <pic:cNvPr id="0" name="deployment_montage.jpg"/>
+                    <pic:cNvPicPr/>
+                  </pic:nvPicPr>
+                  <pic:blipFill>
+                    <a:blip r:embed="rId9"/>
+                    <a:stretch>
+                      <a:fillRect/>
+                    </a:stretch>
+                  </pic:blipFill>
+                  <pic:spPr>
+                    <a:xfrm>
+                      <a:off x="0" y="0"/>
+                      <a:ext cx="5669280" cy="3864317"/>
+                    </a:xfrm>
+                    <a:prstGeom prst="rect">
+                      <a:avLst/>
+                    </a:prstGeom>
+                  </pic:spPr>
+                </pic:pic>
+              </a:graphicData>
+            </a:graphic>
+          </wp:inline>
+        </w:drawing>
+      </w:r>
+    </w:p>
+    <w:p>
+      <w:pPr>
+        <w:pStyle w:val="Heading2"/>
+      </w:pPr>
+      <w:r>
+        <w:t>References and project artifacts</w:t>
       </w:r>
     </w:p>
     <w:p>
       <w:pPr>
         <w:pStyle w:val="ListBullet"/>
-      </w:pPr>
-      <w:r>
-        <w:t>Small dataset and limited evidence of generalization to new populations.</w:t>
+        <w:spacing w:after="20"/>
+      </w:pPr>
+      <w:r>
+        <w:t xml:space="preserve">Repository: </w:t>
+      </w:r>
+      <w:r>
+        <w:t>https://github.com/Jyoti2025BITS/heart-disease-mlops</w:t>
       </w:r>
     </w:p>
     <w:p>
       <w:pPr>
         <w:pStyle w:val="ListBullet"/>
-      </w:pPr>
-      <w:r>
-        <w:t>Metrics depend on the chosen split and should be regenerated from the final code.</w:t>
+        <w:spacing w:after="20"/>
+      </w:pPr>
+      <w:r>
+        <w:t>Dataset: data/raw/processed.cleveland.data</w:t>
       </w:r>
     </w:p>
     <w:p>
       <w:pPr>
         <w:pStyle w:val="ListBullet"/>
-      </w:pPr>
-      <w:r>
-        <w:t>No claim of clinical validity, regulatory compliance, or production medical readiness.</w:t>
+        <w:spacing w:after="20"/>
+      </w:pPr>
+      <w:r>
+        <w:t>Training: src/train.py; API: src/api.py</w:t>
       </w:r>
     </w:p>
     <w:p>
       <w:pPr>
         <w:pStyle w:val="ListBullet"/>
-      </w:pPr>
-      <w:r>
-        <w:t>Local Minikube deployment was tested successfully; production deployment, external access, and remote-cluster validation remain outside the scope of this demonstration.</w:t>
+        <w:spacing w:after="20"/>
+      </w:pPr>
+      <w:r>
+        <w:t>Model comparison: reports/model_comparison.json</w:t>
       </w:r>
     </w:p>
     <w:p>
       <w:pPr>
         <w:pStyle w:val="ListBullet"/>
-      </w:pPr>
-      <w:r>
-        <w:t>The Docker image and dependencies should be version-pinned for stronger reproducibility.</w:t>
-      </w:r>
-    </w:p>
-    <w:p>
-      <w:pPr>
-        <w:pStyle w:val="Heading2"/>
-      </w:pPr>
-      <w:r>
-        <w:t>9.3 Future improvements</w:t>
-      </w:r>
-    </w:p>
-    <w:p>
-      <w:pPr>
-        <w:pStyle w:val="ListBullet"/>
-      </w:pPr>
-      <w:r>
-        <w:t>Add cross-validation, confidence intervals, calibration, and subgroup evaluation.</w:t>
-      </w:r>
-    </w:p>
-    <w:p>
-      <w:pPr>
-        <w:pStyle w:val="ListBullet"/>
-      </w:pPr>
-      <w:r>
-        <w:t>Pin dependencies and record the training environment and dataset version.</w:t>
-      </w:r>
-    </w:p>
-    <w:p>
-      <w:pPr>
-        <w:pStyle w:val="ListBullet"/>
-      </w:pPr>
-      <w:r>
-        <w:t>Add API integration tests and explicit malformed-input tests.</w:t>
-      </w:r>
-    </w:p>
-    <w:p>
-      <w:pPr>
-        <w:pStyle w:val="ListBullet"/>
-      </w:pPr>
-      <w:r>
-        <w:t>Publish the image to a registry and validate deployment on a remote or configured Kubernetes cluster.</w:t>
-      </w:r>
-    </w:p>
-    <w:p>
-      <w:pPr>
-        <w:pStyle w:val="ListBullet"/>
-      </w:pPr>
-      <w:r>
-        <w:t>Add monitoring for request counts, latency, errors, and prediction distributions.</w:t>
-      </w:r>
-    </w:p>
-    <w:p>
-      <w:pPr>
-        <w:pStyle w:val="ListBullet"/>
-      </w:pPr>
-      <w:r>
-        <w:t>Record a short demo showing EDA, training/MLflow, CI, and API verification.</w:t>
-      </w:r>
-    </w:p>
-    <w:p>
-      <w:pPr>
-        <w:pStyle w:val="Heading2"/>
-      </w:pPr>
-      <w:r>
-        <w:t>9.4 Conclusion</w:t>
-      </w:r>
-    </w:p>
-    <w:p>
-      <w:r>
-        <w:t>The project demonstrates a practical MLOps workflow from dataset inspection and model comparison through experiment tracking, API serving, testing, CI, and container packaging. The selected Random Forest pipeline achieved the recorded comparison metrics and was successfully served by the FastAPI application in Docker Compose. The application was also deployed and validated on a local Minikube Kubernetes cluster. A production or remote-cluster deployment has not been claimed.</w:t>
-      </w:r>
-      <w:r/>
-    </w:p>
-    <w:p>
-      <w:pPr>
-        <w:pStyle w:val="Heading2"/>
-      </w:pPr>
-      <w:r>
-        <w:t>Repository</w:t>
-      </w:r>
-    </w:p>
-    <w:p>
-      <w:r>
-        <w:t>https://github.com/Jyoti2025BITS/heart-disease-mlops</w:t>
-      </w:r>
-    </w:p>
-    <w:p>
-      <w:pPr>
-        <w:pStyle w:val="ListBullet"/>
-        <w:numPr>
-          <w:ilvl w:val="0"/>
-          <w:numId w:val="0"/>
-        </w:numPr>
-        <w:ind w:left="360"/>
-      </w:pPr>
+        <w:spacing w:after="20"/>
+      </w:pPr>
+      <w:r>
+        <w:t xml:space="preserve">EDA: screenshots/eda/; CI: </w:t>
+      </w:r>
+      <w:r>
+        <w:t>.github/workflows/ci.yml</w:t>
+      </w:r>
+    </w:p>
+    <w:p>
+      <w:r>
+        <w:t>Submission checklist: complete student/course details, verify that the report matches the final code and metrics, confirm the latest CI run passed, and include the demo video as required by the course rubric.</w:t>
+      </w:r>
     </w:p>
     <w:sectPr>
-      <w:footerReference w:type="default" r:id="rId8"/>
+      <w:headerReference w:type="default" r:id="rId10"/>
+      <w:footerReference w:type="default" r:id="rId11"/>
       <w:pgSz w:w="12240" w:h="15840"/>
-      <w:pgMar w:top="1008" w:right="1152" w:bottom="936" w:left="1152" w:header="720" w:footer="720" w:gutter="0"/>
+      <w:pgMar w:top="936" w:right="1080" w:bottom="864" w:left="1080" w:header="720" w:footer="720" w:gutter="0"/>
       <w:cols w:space="720"/>
       <w:docGrid w:linePitch="360"/>
     </w:sectPr>
@@ -2240,10 +2909,16 @@
       <w:jc w:val="center"/>
     </w:pPr>
     <w:r>
+      <w:rPr>
+        <w:sz w:val="16"/>
+      </w:rPr>
+      <w:t xml:space="preserve">Heart Disease Classification Pipeline  •  </w:t>
+    </w:r>
+    <w:r>
       <w:fldChar w:fldCharType="begin"/>
     </w:r>
     <w:r>
-      <w:instrText xml:space="preserve"> PAGE </w:instrText>
+      <w:instrText>PAGE</w:instrText>
     </w:r>
     <w:r>
       <w:fldChar w:fldCharType="separate"/>
@@ -2284,6 +2959,24 @@
     </w:p>
   </w:footnote>
 </w:footnotes>
+</file>
+
+<file path=word/header1.xml><?xml version="1.0" encoding="utf-8"?>
+<w:hdr xmlns:wpc="http://schemas.microsoft.com/office/word/2010/wordprocessingCanvas" xmlns:cx="http://schemas.microsoft.com/office/drawing/2014/chartex" xmlns:cx1="http://schemas.microsoft.com/office/drawing/2015/9/8/chartex" xmlns:cx2="http://schemas.microsoft.com/office/drawing/2015/10/21/chartex" xmlns:cx3="http://schemas.microsoft.com/office/drawing/2016/5/9/chartex" xmlns:cx4="http://schemas.microsoft.com/office/drawing/2016/5/10/chartex" xmlns:cx5="http://schemas.microsoft.com/office/drawing/2016/5/11/chartex" xmlns:cx6="http://schemas.microsoft.com/office/drawing/2016/5/12/chartex" xmlns:cx7="http://schemas.microsoft.com/office/drawing/2016/5/13/chartex" xmlns:cx8="http://schemas.microsoft.com/office/drawing/2016/5/14/chartex" xmlns:mc="http://schemas.openxmlformats.org/markup-compatibility/2006" xmlns:aink="http://schemas.microsoft.com/office/drawing/2016/ink" xmlns:am3d="http://schemas.microsoft.com/office/drawing/2017/model3d" xmlns:o="urn:schemas-microsoft-com:office:office" xmlns:oel="http://schemas.microsoft.com/office/2019/extlst" xmlns:r="http://schemas.openxmlformats.org/officeDocument/2006/relationships" xmlns:m="http://schemas.openxmlformats.org/officeDocument/2006/math" xmlns:v="urn:schemas-microsoft-com:vml" xmlns:wp14="http://schemas.microsoft.com/office/word/2010/wordprocessingDrawing" xmlns:wp="http://schemas.openxmlformats.org/drawingml/2006/wordprocessingDrawing" xmlns:w10="urn:schemas-microsoft-com:office:word" xmlns:w="http://schemas.openxmlformats.org/wordprocessingml/2006/main" xmlns:w14="http://schemas.microsoft.com/office/word/2010/wordml" xmlns:w15="http://schemas.microsoft.com/office/word/2012/wordml" xmlns:w16cex="http://schemas.microsoft.com/office/word/2018/wordml/cex" xmlns:w16cid="http://schemas.microsoft.com/office/word/2016/wordml/cid" xmlns:w16="http://schemas.microsoft.com/office/word/2018/wordml" xmlns:w16sdtdh="http://schemas.microsoft.com/office/word/2020/wordml/sdtdatahash" xmlns:w16se="http://schemas.microsoft.com/office/word/2015/wordml/symex" xmlns:wpg="http://schemas.microsoft.com/office/word/2010/wordprocessingGroup" xmlns:wpi="http://schemas.microsoft.com/office/word/2010/wordprocessingInk" xmlns:wne="http://schemas.microsoft.com/office/word/2006/wordml" xmlns:wps="http://schemas.microsoft.com/office/word/2010/wordprocessingShape" mc:Ignorable="w14 w15 w16se w16cid w16 w16cex w16sdtdh wp14">
+  <w:p>
+    <w:pPr>
+      <w:pStyle w:val="Header"/>
+      <w:jc w:val="right"/>
+    </w:pPr>
+    <w:r>
+      <w:rPr>
+        <w:color w:val="646464"/>
+        <w:sz w:val="16"/>
+      </w:rPr>
+      <w:t>MLOps Assignment 01 | Heart Disease Classification</w:t>
+    </w:r>
+  </w:p>
+</w:hdr>
 </file>
 
 <file path=word/numbering.xml><?xml version="1.0" encoding="utf-8"?>
@@ -2880,7 +3573,7 @@
     <w:qFormat/>
     <w:rsid w:val="00FC693F"/>
     <w:pPr>
-      <w:spacing w:after="80"/>
+      <w:spacing w:after="60"/>
     </w:pPr>
     <w:rPr>
       <w:rFonts w:ascii="Arial" w:hAnsi="Arial"/>
@@ -2905,8 +3598,8 @@
       <w:rFonts w:asciiTheme="majorHAnsi" w:eastAsiaTheme="majorEastAsia" w:hAnsiTheme="majorHAnsi" w:cstheme="majorBidi"/>
       <w:b/>
       <w:bCs/>
-      <w:color w:val="365F91" w:themeColor="accent1" w:themeShade="BF"/>
-      <w:sz w:val="30"/>
+      <w:color w:val="1F4E79"/>
+      <w:sz w:val="34"/>
       <w:szCs w:val="28"/>
     </w:rPr>
   </w:style>
@@ -2929,7 +3622,7 @@
       <w:rFonts w:asciiTheme="majorHAnsi" w:eastAsiaTheme="majorEastAsia" w:hAnsiTheme="majorHAnsi" w:cstheme="majorBidi"/>
       <w:b/>
       <w:bCs/>
-      <w:color w:val="4F81BD" w:themeColor="accent1"/>
+      <w:color w:val="2E74B5"/>
       <w:sz w:val="22"/>
       <w:szCs w:val="26"/>
     </w:rPr>
@@ -3239,7 +3932,7 @@
       <w:color w:val="17365D" w:themeColor="text2" w:themeShade="BF"/>
       <w:spacing w:val="5"/>
       <w:kern w:val="28"/>
-      <w:sz w:val="44"/>
+      <w:sz w:val="56"/>
       <w:szCs w:val="52"/>
     </w:rPr>
   </w:style>

</xml_diff>